<commit_message>
Intro cinematica y muerte glitcheada del jefe, fix oleada 2
Intro del jefe: barras de cine, viñeta, temblor, calma, acecho lento con lente negro vibrante y sonido de vibracion, estallido y nombre en serifa; HUD oculto; el reintento no repite cartel ni barras.
Muerte: sonido cortado y glitch caotico del jefe con particulas y sonido propio. Oleada 2: invocados fuera de la sala cuentan como muertos. Incluye cambios pendientes de menu, GDD y escenas.

Co-Authored-By: Claude Sonnet 5.5 <noreply@anthropic.com>
</commit_message>
<xml_diff>
--- a/docs/GDD Spirit Keeper.docx
+++ b/docs/GDD Spirit Keeper.docx
@@ -4,7 +4,7 @@
   <w:body>
     <w:p>
       <w:pPr>
-        <w:spacing w:before="200"/>
+        <w:spacing w:before="2600" w:after="600"/>
         <w:jc w:val="center"/>
       </w:pPr>
       <w:r>
@@ -12,7 +12,7 @@
           <w:noProof/>
         </w:rPr>
         <w:drawing>
-          <wp:inline distT="0" distB="0" distL="0" distR="0" wp14:anchorId="151C3B1C" wp14:editId="77146654">
+          <wp:inline distT="0" distB="0" distL="0" distR="0" wp14:anchorId="73213AB2" wp14:editId="5CD5B559">
             <wp:extent cx="5486400" cy="1238250"/>
             <wp:effectExtent l="0" t="0" r="0" b="0"/>
             <wp:docPr id="1" name="banner.png" descr="banner.png" title="banner.png"/>
@@ -51,12 +51,6 @@
         </w:drawing>
       </w:r>
     </w:p>
-    <w:p/>
-    <w:p/>
-    <w:p/>
-    <w:p/>
-    <w:p/>
-    <w:p/>
     <w:p>
       <w:pPr>
         <w:jc w:val="center"/>
@@ -89,20 +83,7 @@
     </w:p>
     <w:p>
       <w:pPr>
-        <w:rPr>
-          <w:lang w:val="en-US"/>
-        </w:rPr>
-      </w:pPr>
-    </w:p>
-    <w:p>
-      <w:pPr>
-        <w:rPr>
-          <w:lang w:val="en-US"/>
-        </w:rPr>
-      </w:pPr>
-    </w:p>
-    <w:p>
-      <w:pPr>
+        <w:spacing w:before="1200"/>
         <w:jc w:val="center"/>
       </w:pPr>
       <w:r>
@@ -133,22 +114,13 @@
         <w:t>Moreno, Tomás Matías - 47583852</w:t>
       </w:r>
     </w:p>
-    <w:p/>
-    <w:p/>
-    <w:p>
-      <w:pPr>
+    <w:p>
+      <w:pPr>
+        <w:spacing w:before="900"/>
         <w:jc w:val="center"/>
       </w:pPr>
       <w:r>
-        <w:t>Universidad Nacional de Rafaela (</w:t>
-      </w:r>
-      <w:proofErr w:type="spellStart"/>
-      <w:r>
-        <w:t>UNRaf</w:t>
-      </w:r>
-      <w:proofErr w:type="spellEnd"/>
-      <w:r>
-        <w:t>)</w:t>
+        <w:t>Universidad Nacional de Rafaela (UNRaf)</w:t>
       </w:r>
     </w:p>
     <w:p>
@@ -171,26 +143,16 @@
       <w:pPr>
         <w:jc w:val="center"/>
       </w:pPr>
-      <w:proofErr w:type="spellStart"/>
-      <w:r>
-        <w:t>Nazzetta</w:t>
-      </w:r>
-      <w:proofErr w:type="spellEnd"/>
-      <w:r>
-        <w:t>, Sebastián</w:t>
+      <w:r>
+        <w:t>Nazzetta, Sebastián</w:t>
       </w:r>
     </w:p>
     <w:p>
       <w:pPr>
         <w:jc w:val="center"/>
       </w:pPr>
-      <w:proofErr w:type="spellStart"/>
-      <w:r>
-        <w:t>Porello</w:t>
-      </w:r>
-      <w:proofErr w:type="spellEnd"/>
-      <w:r>
-        <w:t>, Diego</w:t>
+      <w:r>
+        <w:t>Porello, Diego</w:t>
       </w:r>
     </w:p>
     <w:p>
@@ -224,7 +186,6 @@
         <w:t xml:space="preserve"> --------------------------------------------- 3</w:t>
       </w:r>
     </w:p>
-    <w:p/>
     <w:p>
       <w:r>
         <w:rPr>
@@ -233,47 +194,41 @@
           <w:sz w:val="28"/>
           <w:szCs w:val="28"/>
         </w:rPr>
-        <w:t xml:space="preserve">Descripción, Resumen y Core </w:t>
-      </w:r>
-      <w:proofErr w:type="spellStart"/>
-      <w:r>
-        <w:rPr>
-          <w:b/>
-          <w:bCs/>
+        <w:t>Descripción, Resumen y Core loop</w:t>
+      </w:r>
+      <w:r>
+        <w:rPr>
           <w:sz w:val="28"/>
           <w:szCs w:val="28"/>
         </w:rPr>
-        <w:t>loop</w:t>
-      </w:r>
-      <w:proofErr w:type="spellEnd"/>
-      <w:r>
-        <w:rPr>
+        <w:t xml:space="preserve"> -------------------------- 4</w:t>
+      </w:r>
+    </w:p>
+    <w:p>
+      <w:r>
+        <w:rPr>
+          <w:b/>
+          <w:bCs/>
           <w:sz w:val="28"/>
           <w:szCs w:val="28"/>
         </w:rPr>
-        <w:t xml:space="preserve"> -------------------------- 4</w:t>
-      </w:r>
-    </w:p>
-    <w:p/>
-    <w:p>
-      <w:r>
-        <w:rPr>
-          <w:b/>
-          <w:bCs/>
+        <w:t>Pilares de diseño</w:t>
+      </w:r>
+      <w:r>
+        <w:rPr>
           <w:sz w:val="28"/>
           <w:szCs w:val="28"/>
         </w:rPr>
-        <w:t>Pilares de diseño</w:t>
+        <w:t xml:space="preserve"> -----------</w:t>
       </w:r>
       <w:r>
         <w:rPr>
           <w:sz w:val="28"/>
           <w:szCs w:val="28"/>
         </w:rPr>
-        <w:t xml:space="preserve"> --------------------------------------------- 5</w:t>
-      </w:r>
-    </w:p>
-    <w:p/>
+        <w:t>---------------------------------- 5</w:t>
+      </w:r>
+    </w:p>
     <w:p>
       <w:r>
         <w:rPr>
@@ -289,10 +244,9 @@
           <w:sz w:val="28"/>
           <w:szCs w:val="28"/>
         </w:rPr>
-        <w:t xml:space="preserve"> ------------------------------------------ 6</w:t>
-      </w:r>
-    </w:p>
-    <w:p/>
+        <w:t xml:space="preserve"> ------------------------------------------ 5</w:t>
+      </w:r>
+    </w:p>
     <w:p>
       <w:r>
         <w:rPr>
@@ -311,9 +265,7 @@
         <w:t xml:space="preserve"> ------------------------------------------------------- 7</w:t>
       </w:r>
     </w:p>
-    <w:p/>
-    <w:p>
-      <w:proofErr w:type="spellStart"/>
+    <w:p>
       <w:r>
         <w:rPr>
           <w:b/>
@@ -323,24 +275,24 @@
         </w:rPr>
         <w:t>Gameplay</w:t>
       </w:r>
-      <w:proofErr w:type="spellEnd"/>
       <w:r>
         <w:rPr>
           <w:sz w:val="28"/>
           <w:szCs w:val="28"/>
         </w:rPr>
-        <w:t xml:space="preserve"> ---------------------------------------------</w:t>
-      </w:r>
-      <w:r>
-        <w:rPr>
+        <w:t xml:space="preserve"> -------------------------------------------------------- 7</w:t>
+      </w:r>
+    </w:p>
+    <w:p>
+      <w:r>
+        <w:rPr>
+          <w:b/>
+          <w:bCs/>
           <w:sz w:val="28"/>
           <w:szCs w:val="28"/>
         </w:rPr>
-        <w:t>----------- 8</w:t>
-      </w:r>
-    </w:p>
-    <w:p/>
-    <w:p>
+        <w:t>Formas (personajes</w:t>
+      </w:r>
       <w:r>
         <w:rPr>
           <w:b/>
@@ -348,17 +300,16 @@
           <w:sz w:val="28"/>
           <w:szCs w:val="28"/>
         </w:rPr>
-        <w:t>Formas (personajes) y Enemigos</w:t>
+        <w:t>) y Enemigos</w:t>
       </w:r>
       <w:r>
         <w:rPr>
           <w:sz w:val="28"/>
           <w:szCs w:val="28"/>
         </w:rPr>
-        <w:t xml:space="preserve"> ---------------------------- 9</w:t>
-      </w:r>
-    </w:p>
-    <w:p/>
+        <w:t xml:space="preserve"> ---------------------------- 8</w:t>
+      </w:r>
+    </w:p>
     <w:p>
       <w:r>
         <w:rPr>
@@ -374,10 +325,9 @@
           <w:sz w:val="28"/>
           <w:szCs w:val="28"/>
         </w:rPr>
-        <w:t xml:space="preserve"> ----------------------------------------- 10</w:t>
-      </w:r>
-    </w:p>
-    <w:p/>
+        <w:t xml:space="preserve"> ----------------------------------------- 9</w:t>
+      </w:r>
+    </w:p>
     <w:p>
       <w:r>
         <w:rPr>
@@ -393,10 +343,9 @@
           <w:sz w:val="28"/>
           <w:szCs w:val="28"/>
         </w:rPr>
-        <w:t xml:space="preserve"> ----------------------------------------------------- 11</w:t>
-      </w:r>
-    </w:p>
-    <w:p/>
+        <w:t xml:space="preserve"> ----------------------------------------------------- 9</w:t>
+      </w:r>
+    </w:p>
     <w:p>
       <w:r>
         <w:rPr>
@@ -412,100 +361,88 @@
           <w:sz w:val="28"/>
           <w:szCs w:val="28"/>
         </w:rPr>
-        <w:t xml:space="preserve"> ---------</w:t>
-      </w:r>
-      <w:r>
-        <w:rPr>
+        <w:t xml:space="preserve"> -------------------------- 10</w:t>
+      </w:r>
+    </w:p>
+    <w:p>
+      <w:r>
+        <w:rPr>
+          <w:b/>
+          <w:bCs/>
           <w:sz w:val="28"/>
           <w:szCs w:val="28"/>
         </w:rPr>
-        <w:t>----------------- 11</w:t>
-      </w:r>
-    </w:p>
-    <w:p/>
-    <w:p>
-      <w:r>
-        <w:rPr>
-          <w:b/>
-          <w:bCs/>
+        <w:t>Apartado Visual</w:t>
+      </w:r>
+      <w:r>
+        <w:rPr>
           <w:sz w:val="28"/>
           <w:szCs w:val="28"/>
         </w:rPr>
-        <w:t>Apartado Visual</w:t>
-      </w:r>
-      <w:r>
-        <w:rPr>
+        <w:t xml:space="preserve"> ----------------------------------------------- 10</w:t>
+      </w:r>
+    </w:p>
+    <w:p>
+      <w:r>
+        <w:rPr>
+          <w:b/>
+          <w:bCs/>
           <w:sz w:val="28"/>
           <w:szCs w:val="28"/>
         </w:rPr>
-        <w:t xml:space="preserve"> ----------------------------------------------- 12</w:t>
-      </w:r>
-    </w:p>
-    <w:p/>
-    <w:p>
-      <w:r>
-        <w:rPr>
-          <w:b/>
-          <w:bCs/>
+        <w:t>Efectos visuales (FX) y Audio</w:t>
+      </w:r>
+      <w:r>
+        <w:rPr>
           <w:sz w:val="28"/>
           <w:szCs w:val="28"/>
         </w:rPr>
-        <w:t>Efectos visuales (FX) y Audio</w:t>
-      </w:r>
-      <w:r>
-        <w:rPr>
+        <w:t xml:space="preserve"> ------------------------------ 11</w:t>
+      </w:r>
+    </w:p>
+    <w:p>
+      <w:r>
+        <w:rPr>
+          <w:b/>
+          <w:bCs/>
           <w:sz w:val="28"/>
           <w:szCs w:val="28"/>
         </w:rPr>
-        <w:t xml:space="preserve"> ------------------------------ 13</w:t>
-      </w:r>
-    </w:p>
-    <w:p/>
-    <w:p>
-      <w:r>
-        <w:rPr>
-          <w:b/>
-          <w:bCs/>
+        <w:t>Datos Adicionales</w:t>
+      </w:r>
+      <w:r>
+        <w:rPr>
           <w:sz w:val="28"/>
           <w:szCs w:val="28"/>
         </w:rPr>
-        <w:t>Datos Adicionales</w:t>
-      </w:r>
-      <w:r>
-        <w:rPr>
+        <w:t xml:space="preserve"> --------------------------------------------- 11</w:t>
+      </w:r>
+    </w:p>
+    <w:p>
+      <w:r>
+        <w:rPr>
+          <w:b/>
+          <w:bCs/>
           <w:sz w:val="28"/>
           <w:szCs w:val="28"/>
         </w:rPr>
-        <w:t xml:space="preserve"> --------------------------------------------- 14</w:t>
-      </w:r>
-    </w:p>
-    <w:p/>
-    <w:p>
-      <w:r>
-        <w:rPr>
-          <w:b/>
-          <w:bCs/>
+        <w:t>Público objetivo</w:t>
+      </w:r>
+      <w:r>
+        <w:rPr>
           <w:sz w:val="28"/>
           <w:szCs w:val="28"/>
         </w:rPr>
-        <w:t>Público objetivo</w:t>
+        <w:t xml:space="preserve"> ----------</w:t>
       </w:r>
       <w:r>
         <w:rPr>
           <w:sz w:val="28"/>
           <w:szCs w:val="28"/>
         </w:rPr>
-        <w:t xml:space="preserve"> ----------------</w:t>
-      </w:r>
-      <w:r>
-        <w:rPr>
-          <w:sz w:val="28"/>
-          <w:szCs w:val="28"/>
-        </w:rPr>
-        <w:t>------------------------------ 14</w:t>
-      </w:r>
-    </w:p>
-    <w:p/>
+        <w:t>------------------------------------ 11</w:t>
+      </w:r>
+    </w:p>
     <w:p>
       <w:pPr>
         <w:pageBreakBefore/>
@@ -517,7 +454,7 @@
         </w:rPr>
         <w:lastRenderedPageBreak/>
         <w:drawing>
-          <wp:inline distT="0" distB="0" distL="0" distR="0" wp14:anchorId="64A69774" wp14:editId="660D2F8E">
+          <wp:inline distT="0" distB="0" distL="0" distR="0" wp14:anchorId="0D9B0CC0" wp14:editId="1044C711">
             <wp:extent cx="5143500" cy="5514975"/>
             <wp:effectExtent l="0" t="0" r="0" b="0"/>
             <wp:docPr id="2" name="flujo.png" descr="flujo.png" title="flujo.png"/>
@@ -573,21 +510,8 @@
       <w:pPr>
         <w:spacing w:after="200" w:line="276" w:lineRule="auto"/>
       </w:pPr>
-      <w:proofErr w:type="spellStart"/>
-      <w:r>
-        <w:t>Spirit</w:t>
-      </w:r>
-      <w:proofErr w:type="spellEnd"/>
-      <w:r>
-        <w:t xml:space="preserve"> </w:t>
-      </w:r>
-      <w:proofErr w:type="spellStart"/>
-      <w:r>
-        <w:t>Keeper</w:t>
-      </w:r>
-      <w:proofErr w:type="spellEnd"/>
-      <w:r>
-        <w:t xml:space="preserve"> es un videojuego de acción y plataformas 2D con vista lateral, en el cual el jugador controla a un padre que se interna en un bosque corrupto para rescatar a su hijo, secuestrado por una secta. Un amuleto con espíritus guardianes le presta tr</w:t>
+      <w:r>
+        <w:t>Spirit Keeper es un videojuego de acción y plataformas 2D con vista lateral, en el cual el jugador controla a un padre que se interna en un bosque corrupto para rescatar a su hijo, secuestrado por una secta. Un amuleto con espíritus guardianes le presta tr</w:t>
       </w:r>
       <w:r>
         <w:t>es transformaciones (Lobo, Murciélago y Oso) y cada una cambia la forma de moverse, pelear y resolver obstáculos.</w:t>
@@ -602,15 +526,7 @@
         <w:t xml:space="preserve">Género: </w:t>
       </w:r>
       <w:r>
-        <w:t>Acción / Plataformas 2D (</w:t>
-      </w:r>
-      <w:proofErr w:type="spellStart"/>
-      <w:r>
-        <w:t>side-scroller</w:t>
-      </w:r>
-      <w:proofErr w:type="spellEnd"/>
-      <w:r>
-        <w:t>)</w:t>
+        <w:t>Acción / Plataformas 2D (side-scroller)</w:t>
       </w:r>
     </w:p>
     <w:p>
@@ -637,42 +553,10 @@
         <w:t xml:space="preserve">Inspiraciones: </w:t>
       </w:r>
       <w:r>
-        <w:t xml:space="preserve">Ben 10: </w:t>
-      </w:r>
-      <w:proofErr w:type="spellStart"/>
-      <w:r>
-        <w:t>Alien</w:t>
-      </w:r>
-      <w:proofErr w:type="spellEnd"/>
-      <w:r>
-        <w:t xml:space="preserve"> </w:t>
-      </w:r>
-      <w:proofErr w:type="spellStart"/>
-      <w:r>
-        <w:t>Forc</w:t>
-      </w:r>
-      <w:r>
-        <w:t>e</w:t>
-      </w:r>
-      <w:proofErr w:type="spellEnd"/>
-      <w:r>
-        <w:t xml:space="preserve"> (referencia mecánica), </w:t>
-      </w:r>
-      <w:proofErr w:type="spellStart"/>
-      <w:r>
-        <w:t>Hollow</w:t>
-      </w:r>
-      <w:proofErr w:type="spellEnd"/>
-      <w:r>
-        <w:t xml:space="preserve"> </w:t>
-      </w:r>
-      <w:proofErr w:type="spellStart"/>
-      <w:r>
-        <w:t>Knight</w:t>
-      </w:r>
-      <w:proofErr w:type="spellEnd"/>
-      <w:r>
-        <w:t xml:space="preserve"> (jefe y atmósfera)</w:t>
+        <w:t>Ben 10: Alien Forc</w:t>
+      </w:r>
+      <w:r>
+        <w:t>e (referencia mecánica), Hollow Knight (jefe y atmósfera)</w:t>
       </w:r>
     </w:p>
     <w:p>
@@ -691,15 +575,7 @@
         <w:spacing w:after="200" w:line="276" w:lineRule="auto"/>
       </w:pPr>
       <w:r>
-        <w:t xml:space="preserve">El jugador comienza como el Humano, una forma débil pero técnica (bloquea y hace </w:t>
-      </w:r>
-      <w:proofErr w:type="spellStart"/>
-      <w:r>
-        <w:t>parry</w:t>
-      </w:r>
-      <w:proofErr w:type="spellEnd"/>
-      <w:r>
-        <w:t>). A medida que avanza encuentra tótems que despiertan a los espíritus del amuleto y le otorgan nuevas f</w:t>
+        <w:t>El jugador comienza como el Humano, una forma débil pero técnica (bloquea y hace parry). A medida que avanza encuentra tótems que despiertan a los espíritus del amuleto y le otorgan nuevas f</w:t>
       </w:r>
       <w:r>
         <w:t>ormas. Cada forma abre ciertos caminos: el doble salto del Lobo, el planeo y el disparo sónico del Murciélago, la fuerza del Oso.</w:t>
@@ -713,15 +589,7 @@
         <w:t>Transformarse consume energía, que se recarga recogiendo almas y venciendo enemigos. Con los fragmentos que junta sube de nive</w:t>
       </w:r>
       <w:r>
-        <w:t xml:space="preserve">l y elige el combo de una de sus formas. El juego tiene un final: la pelea contra el </w:t>
-      </w:r>
-      <w:proofErr w:type="gramStart"/>
-      <w:r>
-        <w:t>Arzobispo</w:t>
-      </w:r>
-      <w:proofErr w:type="gramEnd"/>
-      <w:r>
-        <w:t>, jefe de la secta, que exige usar todas las formas aprendidas para liberar al hijo.</w:t>
+        <w:t>l y elige el combo de una de sus formas. El juego tiene un final: la pelea contra el Arzobispo, jefe de la secta, que exige usar todas las formas aprendidas para liberar al hijo.</w:t>
       </w:r>
     </w:p>
     <w:p>
@@ -732,13 +600,8 @@
         <w:jc w:val="center"/>
       </w:pPr>
       <w:r>
-        <w:t xml:space="preserve">Core </w:t>
-      </w:r>
-      <w:proofErr w:type="spellStart"/>
-      <w:r>
-        <w:t>Loop</w:t>
-      </w:r>
-      <w:proofErr w:type="spellEnd"/>
+        <w:t>Core Loop</w:t>
+      </w:r>
     </w:p>
     <w:p>
       <w:pPr>
@@ -750,9 +613,9 @@
           <w:noProof/>
         </w:rPr>
         <w:drawing>
-          <wp:inline distT="0" distB="0" distL="0" distR="0" wp14:anchorId="22E64270" wp14:editId="2BC444E4">
-            <wp:extent cx="2167890" cy="2167890"/>
-            <wp:effectExtent l="0" t="0" r="3810" b="3810"/>
+          <wp:inline distT="0" distB="0" distL="0" distR="0" wp14:anchorId="39959C2F" wp14:editId="3B959C14">
+            <wp:extent cx="2171700" cy="2171700"/>
+            <wp:effectExtent l="0" t="0" r="0" b="0"/>
             <wp:docPr id="3" name="coreloop.png" descr="coreloop.png" title="coreloop.png"/>
             <wp:cNvGraphicFramePr>
               <a:graphicFrameLocks xmlns:a="http://schemas.openxmlformats.org/drawingml/2006/main" noChangeAspect="1"/>
@@ -776,7 +639,7 @@
                   <pic:spPr bwMode="auto">
                     <a:xfrm>
                       <a:off x="0" y="0"/>
-                      <a:ext cx="2167890" cy="2167890"/>
+                      <a:ext cx="2171700" cy="2171700"/>
                     </a:xfrm>
                     <a:prstGeom prst="rect">
                       <a:avLst/>
@@ -842,21 +705,12 @@
       <w:pPr>
         <w:spacing w:after="200" w:line="276" w:lineRule="auto"/>
       </w:pPr>
-      <w:proofErr w:type="spellStart"/>
-      <w:r>
-        <w:rPr>
-          <w:b/>
-          <w:bCs/>
-        </w:rPr>
-        <w:t>Feedback</w:t>
-      </w:r>
-      <w:proofErr w:type="spellEnd"/>
-      <w:r>
-        <w:rPr>
-          <w:b/>
-          <w:bCs/>
-        </w:rPr>
-        <w:t xml:space="preserve">: </w:t>
+      <w:r>
+        <w:rPr>
+          <w:b/>
+          <w:bCs/>
+        </w:rPr>
+        <w:t xml:space="preserve">Feedback: </w:t>
       </w:r>
       <w:r>
         <w:t>toda acción del jugador conlleva a su respectiva respuesta inmediata, sea visual o sonora, con el fin de brindar una buena experiencia.</w:t>
@@ -896,6 +750,71 @@
     </w:p>
     <w:p>
       <w:pPr>
+        <w:spacing w:before="100" w:after="200"/>
+        <w:jc w:val="center"/>
+      </w:pPr>
+      <w:r>
+        <w:rPr>
+          <w:noProof/>
+        </w:rPr>
+        <w:drawing>
+          <wp:inline distT="0" distB="0" distL="0" distR="0" wp14:anchorId="75917F68" wp14:editId="69D1B84F">
+            <wp:extent cx="3619500" cy="2038350"/>
+            <wp:effectExtent l="0" t="0" r="0" b="0"/>
+            <wp:docPr id="4" name="comic1.png" descr="comic1.png" title="comic1.png"/>
+            <wp:cNvGraphicFramePr>
+              <a:graphicFrameLocks xmlns:a="http://schemas.openxmlformats.org/drawingml/2006/main" noChangeAspect="1"/>
+            </wp:cNvGraphicFramePr>
+            <a:graphic xmlns:a="http://schemas.openxmlformats.org/drawingml/2006/main">
+              <a:graphicData uri="http://schemas.openxmlformats.org/drawingml/2006/picture">
+                <pic:pic xmlns:pic="http://schemas.openxmlformats.org/drawingml/2006/picture">
+                  <pic:nvPicPr>
+                    <pic:cNvPr id="0" name=""/>
+                    <pic:cNvPicPr>
+                      <a:picLocks noChangeAspect="1" noChangeArrowheads="1"/>
+                    </pic:cNvPicPr>
+                  </pic:nvPicPr>
+                  <pic:blipFill>
+                    <a:blip r:embed="rId8"/>
+                    <a:srcRect/>
+                    <a:stretch>
+                      <a:fillRect/>
+                    </a:stretch>
+                  </pic:blipFill>
+                  <pic:spPr bwMode="auto">
+                    <a:xfrm>
+                      <a:off x="0" y="0"/>
+                      <a:ext cx="3619500" cy="2038350"/>
+                    </a:xfrm>
+                    <a:prstGeom prst="rect">
+                      <a:avLst/>
+                    </a:prstGeom>
+                  </pic:spPr>
+                </pic:pic>
+              </a:graphicData>
+            </a:graphic>
+          </wp:inline>
+        </w:drawing>
+      </w:r>
+    </w:p>
+    <w:p>
+      <w:pPr>
+        <w:spacing w:after="200"/>
+        <w:jc w:val="center"/>
+      </w:pPr>
+      <w:r>
+        <w:rPr>
+          <w:i/>
+          <w:iCs/>
+          <w:color w:val="555555"/>
+          <w:sz w:val="18"/>
+          <w:szCs w:val="18"/>
+        </w:rPr>
+        <w:t>Cómic de inicio</w:t>
+      </w:r>
+    </w:p>
+    <w:p>
+      <w:pPr>
         <w:spacing w:after="200" w:line="276" w:lineRule="auto"/>
       </w:pPr>
       <w:r>
@@ -906,15 +825,76 @@
         <w:t xml:space="preserve">Final: </w:t>
       </w:r>
       <w:r>
-        <w:t xml:space="preserve">al vencer al </w:t>
-      </w:r>
-      <w:proofErr w:type="gramStart"/>
-      <w:r>
-        <w:t>Arzobispo</w:t>
-      </w:r>
-      <w:proofErr w:type="gramEnd"/>
-      <w:r>
-        <w:t xml:space="preserve"> el sello cede y el hijo emerge de la luz. Padre y Amuleto dialogan brevemente, corte a negro y aparece la frase final: “Lo que el bosque se llevó, el bosque lo devuelve.”</w:t>
+        <w:t>al vencer al Arzobispo el sello cede y el hijo emerge de la luz. Padre y Amuleto dialogan brevemente, corte a negro y aparece la frase final: “Lo que el bosque se llevó, el bosque lo devuelve.” Antes de los créditos, un segundo cómic de seis viñetas muestr</w:t>
+      </w:r>
+      <w:r>
+        <w:t>a el estallido de la estrella, el reencuentro y la confesión del niño.</w:t>
+      </w:r>
+    </w:p>
+    <w:p>
+      <w:pPr>
+        <w:spacing w:before="100" w:after="200"/>
+        <w:jc w:val="center"/>
+      </w:pPr>
+      <w:r>
+        <w:rPr>
+          <w:noProof/>
+        </w:rPr>
+        <w:lastRenderedPageBreak/>
+        <w:drawing>
+          <wp:inline distT="0" distB="0" distL="0" distR="0" wp14:anchorId="2D988E89" wp14:editId="50A0DD75">
+            <wp:extent cx="3619500" cy="2038350"/>
+            <wp:effectExtent l="0" t="0" r="0" b="0"/>
+            <wp:docPr id="5" name="comic2.png" descr="comic2.png" title="comic2.png"/>
+            <wp:cNvGraphicFramePr>
+              <a:graphicFrameLocks xmlns:a="http://schemas.openxmlformats.org/drawingml/2006/main" noChangeAspect="1"/>
+            </wp:cNvGraphicFramePr>
+            <a:graphic xmlns:a="http://schemas.openxmlformats.org/drawingml/2006/main">
+              <a:graphicData uri="http://schemas.openxmlformats.org/drawingml/2006/picture">
+                <pic:pic xmlns:pic="http://schemas.openxmlformats.org/drawingml/2006/picture">
+                  <pic:nvPicPr>
+                    <pic:cNvPr id="0" name=""/>
+                    <pic:cNvPicPr>
+                      <a:picLocks noChangeAspect="1" noChangeArrowheads="1"/>
+                    </pic:cNvPicPr>
+                  </pic:nvPicPr>
+                  <pic:blipFill>
+                    <a:blip r:embed="rId9"/>
+                    <a:srcRect/>
+                    <a:stretch>
+                      <a:fillRect/>
+                    </a:stretch>
+                  </pic:blipFill>
+                  <pic:spPr bwMode="auto">
+                    <a:xfrm>
+                      <a:off x="0" y="0"/>
+                      <a:ext cx="3619500" cy="2038350"/>
+                    </a:xfrm>
+                    <a:prstGeom prst="rect">
+                      <a:avLst/>
+                    </a:prstGeom>
+                  </pic:spPr>
+                </pic:pic>
+              </a:graphicData>
+            </a:graphic>
+          </wp:inline>
+        </w:drawing>
+      </w:r>
+    </w:p>
+    <w:p>
+      <w:pPr>
+        <w:spacing w:after="200"/>
+        <w:jc w:val="center"/>
+      </w:pPr>
+      <w:r>
+        <w:rPr>
+          <w:i/>
+          <w:iCs/>
+          <w:color w:val="555555"/>
+          <w:sz w:val="18"/>
+          <w:szCs w:val="18"/>
+        </w:rPr>
+        <w:t>Cómic final</w:t>
       </w:r>
     </w:p>
     <w:p>
@@ -929,18 +909,10 @@
         <w:t xml:space="preserve">Cinemáticas: </w:t>
       </w:r>
       <w:r>
-        <w:t xml:space="preserve">el cómic de inicio, la </w:t>
-      </w:r>
-      <w:proofErr w:type="spellStart"/>
-      <w:r>
-        <w:t>intro</w:t>
-      </w:r>
-      <w:proofErr w:type="spellEnd"/>
-      <w:r>
-        <w:t xml:space="preserve"> de cada niv</w:t>
-      </w:r>
-      <w:r>
-        <w:t>el, la cinemática de cada tótem (el sello viaja al jugador y aparece la tarjeta de la forma) y las del jefe (aparición y estallido final). Todas ocurren dentro del juego, sin cortar el ritmo.</w:t>
+        <w:t>el cómic de inicio y el final, la intro de cada nivel, la cinemática de cada tótem (el sello viaja al jugador y aparece la tarjeta de la forma) y las del jefe</w:t>
+      </w:r>
+      <w:r>
+        <w:t xml:space="preserve"> (aparición y estallido final). Todas ocurren dentro del juego, sin cortar el ritmo.</w:t>
       </w:r>
     </w:p>
     <w:p>
@@ -948,18 +920,7 @@
         <w:spacing w:after="200" w:line="276" w:lineRule="auto"/>
       </w:pPr>
       <w:r>
-        <w:t>El juego tiene 3 niveles y un nivel de jefe, todos lineales y co</w:t>
-      </w:r>
-      <w:r>
-        <w:t xml:space="preserve">n </w:t>
-      </w:r>
-      <w:proofErr w:type="spellStart"/>
-      <w:r>
-        <w:t>checkpoints</w:t>
-      </w:r>
-      <w:proofErr w:type="spellEnd"/>
-      <w:r>
-        <w:t>:</w:t>
+        <w:t>El juego tiene 3 niveles y un nivel de jefe, todos lineales y con checkpoints:</w:t>
       </w:r>
     </w:p>
     <w:p>
@@ -979,15 +940,10 @@
         <w:t xml:space="preserve">Nivel 1 - El Bosque - </w:t>
       </w:r>
       <w:r>
-        <w:t xml:space="preserve">tutorial. Movimiento, combate, bloqueo y </w:t>
-      </w:r>
-      <w:proofErr w:type="spellStart"/>
-      <w:r>
-        <w:t>parry</w:t>
-      </w:r>
-      <w:proofErr w:type="spellEnd"/>
-      <w:r>
-        <w:t xml:space="preserve"> del Humano. Termina en una cueva donde está el tótem del Lobo; la salida es una zona de oscuridad con el nombre del siguiente nivel.</w:t>
+        <w:t xml:space="preserve">tutorial. Movimiento, combate, bloqueo y parry del Humano. Termina en </w:t>
+      </w:r>
+      <w:r>
+        <w:t>una cueva donde está el tótem del Lobo; la salida es una zona de oscuridad con el nombre del siguiente nivel.</w:t>
       </w:r>
     </w:p>
     <w:p>
@@ -1007,10 +963,13 @@
         <w:t xml:space="preserve">Nivel 2 - Las Cuevas - </w:t>
       </w:r>
       <w:r>
-        <w:t>cueva natural. S</w:t>
-      </w:r>
-      <w:r>
-        <w:t>e desbloquea el Murciélago (planeo, aleteo, picada y sónico). Barreras de cristal, pinchos, un derrumbe, enemigos voladores, fogatas y niebla de cueva.</w:t>
+        <w:t>cueva natural. Se desbloquea el Murciélago (planeo, aleteo, picada y sónico). Barreras de cristal, pinchos, un derrumbe y</w:t>
+      </w:r>
+      <w:r>
+        <w:t xml:space="preserve"> en</w:t>
+      </w:r>
+      <w:r>
+        <w:t>emigos voladores</w:t>
       </w:r>
     </w:p>
     <w:p>
@@ -1030,18 +989,7 @@
         <w:t xml:space="preserve">Nivel 3 - El Latido - </w:t>
       </w:r>
       <w:r>
-        <w:t>cueva profunda donde late el corazón del sello. Se desbloquea el Oso. El latido de</w:t>
-      </w:r>
-      <w:r>
-        <w:t xml:space="preserve"> la luz se acelera hacia el sello; hay </w:t>
-      </w:r>
-      <w:proofErr w:type="spellStart"/>
-      <w:r>
-        <w:t>puzzles</w:t>
-      </w:r>
-      <w:proofErr w:type="spellEnd"/>
-      <w:r>
-        <w:t xml:space="preserve"> que combinan las tres formas y rutas opcionales.</w:t>
+        <w:t>cueva profunda donde late el corazón del sello. Se desbloquea el Oso. El latido de la luz se acelera hacia el sello; hay puzzles que combinan las tres formas y rutas opcionales.</w:t>
       </w:r>
     </w:p>
     <w:p>
@@ -1061,15 +1009,7 @@
         <w:t xml:space="preserve">Jefe - El Santuario - </w:t>
       </w:r>
       <w:r>
-        <w:t xml:space="preserve">arena de la secta. Pelea contra el </w:t>
-      </w:r>
-      <w:proofErr w:type="gramStart"/>
-      <w:r>
-        <w:t>Arzobispo</w:t>
-      </w:r>
-      <w:proofErr w:type="gramEnd"/>
-      <w:r>
-        <w:t xml:space="preserve"> en 3 fases, con cinemáticas de entrada y de muerte.</w:t>
+        <w:t>arena de la secta. Pelea contra el Arzobispo en 3 fases, con cinemáticas de entrada y de muerte.</w:t>
       </w:r>
     </w:p>
     <w:tbl>
@@ -1120,10 +1060,10 @@
                 <w:noProof/>
               </w:rPr>
               <w:drawing>
-                <wp:inline distT="0" distB="0" distL="0" distR="0" wp14:anchorId="7D0A8902" wp14:editId="1836FFA6">
+                <wp:inline distT="0" distB="0" distL="0" distR="0" wp14:anchorId="465CBA7A" wp14:editId="6E6AC684">
                   <wp:extent cx="1695450" cy="952500"/>
                   <wp:effectExtent l="0" t="0" r="0" b="0"/>
-                  <wp:docPr id="4" name="g_n1.png" descr="g_n1.png" title="g_n1.png"/>
+                  <wp:docPr id="6" name="g_n1.png" descr="g_n1.png" title="g_n1.png"/>
                   <wp:cNvGraphicFramePr>
                     <a:graphicFrameLocks xmlns:a="http://schemas.openxmlformats.org/drawingml/2006/main" noChangeAspect="1"/>
                   </wp:cNvGraphicFramePr>
@@ -1137,7 +1077,7 @@
                           </pic:cNvPicPr>
                         </pic:nvPicPr>
                         <pic:blipFill>
-                          <a:blip r:embed="rId8"/>
+                          <a:blip r:embed="rId10"/>
                           <a:srcRect/>
                           <a:stretch>
                             <a:fillRect/>
@@ -1202,10 +1142,10 @@
                 <w:noProof/>
               </w:rPr>
               <w:drawing>
-                <wp:inline distT="0" distB="0" distL="0" distR="0" wp14:anchorId="10FA48C4" wp14:editId="6CC6494A">
+                <wp:inline distT="0" distB="0" distL="0" distR="0" wp14:anchorId="114E9AE2" wp14:editId="0F989D5B">
                   <wp:extent cx="1695450" cy="952500"/>
                   <wp:effectExtent l="0" t="0" r="0" b="0"/>
-                  <wp:docPr id="5" name="g_n2.png" descr="g_n2.png" title="g_n2.png"/>
+                  <wp:docPr id="7" name="g_n2.png" descr="g_n2.png" title="g_n2.png"/>
                   <wp:cNvGraphicFramePr>
                     <a:graphicFrameLocks xmlns:a="http://schemas.openxmlformats.org/drawingml/2006/main" noChangeAspect="1"/>
                   </wp:cNvGraphicFramePr>
@@ -1219,7 +1159,7 @@
                           </pic:cNvPicPr>
                         </pic:nvPicPr>
                         <pic:blipFill>
-                          <a:blip r:embed="rId9"/>
+                          <a:blip r:embed="rId11"/>
                           <a:srcRect/>
                           <a:stretch>
                             <a:fillRect/>
@@ -1284,10 +1224,10 @@
                 <w:noProof/>
               </w:rPr>
               <w:drawing>
-                <wp:inline distT="0" distB="0" distL="0" distR="0" wp14:anchorId="0DF67DAB" wp14:editId="443FBE3F">
+                <wp:inline distT="0" distB="0" distL="0" distR="0" wp14:anchorId="6CD969F2" wp14:editId="6BC26A76">
                   <wp:extent cx="1695450" cy="952500"/>
                   <wp:effectExtent l="0" t="0" r="0" b="0"/>
-                  <wp:docPr id="6" name="g_n3.png" descr="g_n3.png" title="g_n3.png"/>
+                  <wp:docPr id="8" name="g_n3.png" descr="g_n3.png" title="g_n3.png"/>
                   <wp:cNvGraphicFramePr>
                     <a:graphicFrameLocks xmlns:a="http://schemas.openxmlformats.org/drawingml/2006/main" noChangeAspect="1"/>
                   </wp:cNvGraphicFramePr>
@@ -1301,7 +1241,7 @@
                           </pic:cNvPicPr>
                         </pic:nvPicPr>
                         <pic:blipFill>
-                          <a:blip r:embed="rId10"/>
+                          <a:blip r:embed="rId12"/>
                           <a:srcRect/>
                           <a:stretch>
                             <a:fillRect/>
@@ -1370,12 +1310,11 @@
               <w:rPr>
                 <w:noProof/>
               </w:rPr>
-              <w:lastRenderedPageBreak/>
               <w:drawing>
-                <wp:inline distT="0" distB="0" distL="0" distR="0" wp14:anchorId="5C724868" wp14:editId="2750AF99">
+                <wp:inline distT="0" distB="0" distL="0" distR="0" wp14:anchorId="1C7B3352" wp14:editId="3D6C8D68">
                   <wp:extent cx="1695450" cy="952500"/>
                   <wp:effectExtent l="0" t="0" r="0" b="0"/>
-                  <wp:docPr id="7" name="g_t1.png" descr="g_t1.png" title="g_t1.png"/>
+                  <wp:docPr id="9" name="g_t1.png" descr="g_t1.png" title="g_t1.png"/>
                   <wp:cNvGraphicFramePr>
                     <a:graphicFrameLocks xmlns:a="http://schemas.openxmlformats.org/drawingml/2006/main" noChangeAspect="1"/>
                   </wp:cNvGraphicFramePr>
@@ -1389,7 +1328,7 @@
                           </pic:cNvPicPr>
                         </pic:nvPicPr>
                         <pic:blipFill>
-                          <a:blip r:embed="rId11"/>
+                          <a:blip r:embed="rId13"/>
                           <a:srcRect/>
                           <a:stretch>
                             <a:fillRect/>
@@ -1454,10 +1393,10 @@
                 <w:noProof/>
               </w:rPr>
               <w:drawing>
-                <wp:inline distT="0" distB="0" distL="0" distR="0" wp14:anchorId="5D6D570C" wp14:editId="46B158BA">
+                <wp:inline distT="0" distB="0" distL="0" distR="0" wp14:anchorId="0879A69A" wp14:editId="3DF910ED">
                   <wp:extent cx="1695450" cy="952500"/>
                   <wp:effectExtent l="0" t="0" r="0" b="0"/>
-                  <wp:docPr id="8" name="g_t2.png" descr="g_t2.png" title="g_t2.png"/>
+                  <wp:docPr id="10" name="g_t2.png" descr="g_t2.png" title="g_t2.png"/>
                   <wp:cNvGraphicFramePr>
                     <a:graphicFrameLocks xmlns:a="http://schemas.openxmlformats.org/drawingml/2006/main" noChangeAspect="1"/>
                   </wp:cNvGraphicFramePr>
@@ -1471,7 +1410,7 @@
                           </pic:cNvPicPr>
                         </pic:nvPicPr>
                         <pic:blipFill>
-                          <a:blip r:embed="rId12"/>
+                          <a:blip r:embed="rId14"/>
                           <a:srcRect/>
                           <a:stretch>
                             <a:fillRect/>
@@ -1536,10 +1475,10 @@
                 <w:noProof/>
               </w:rPr>
               <w:drawing>
-                <wp:inline distT="0" distB="0" distL="0" distR="0" wp14:anchorId="1CA5AA98" wp14:editId="1A8E4696">
+                <wp:inline distT="0" distB="0" distL="0" distR="0" wp14:anchorId="170B29AB" wp14:editId="224A493C">
                   <wp:extent cx="1695450" cy="952500"/>
                   <wp:effectExtent l="0" t="0" r="0" b="0"/>
-                  <wp:docPr id="9" name="g_t3.png" descr="g_t3.png" title="g_t3.png"/>
+                  <wp:docPr id="11" name="g_t3.png" descr="g_t3.png" title="g_t3.png"/>
                   <wp:cNvGraphicFramePr>
                     <a:graphicFrameLocks xmlns:a="http://schemas.openxmlformats.org/drawingml/2006/main" noChangeAspect="1"/>
                   </wp:cNvGraphicFramePr>
@@ -1553,7 +1492,7 @@
                           </pic:cNvPicPr>
                         </pic:nvPicPr>
                         <pic:blipFill>
-                          <a:blip r:embed="rId13"/>
+                          <a:blip r:embed="rId15"/>
                           <a:srcRect/>
                           <a:stretch>
                             <a:fillRect/>
@@ -1599,23 +1538,8 @@
         <w:spacing w:before="160"/>
       </w:pPr>
       <w:r>
-        <w:t xml:space="preserve">Cada nivel arranca con una </w:t>
-      </w:r>
-      <w:proofErr w:type="spellStart"/>
-      <w:r>
-        <w:t>intro</w:t>
-      </w:r>
-      <w:proofErr w:type="spellEnd"/>
-      <w:r>
-        <w:t xml:space="preserve"> </w:t>
-      </w:r>
-      <w:proofErr w:type="spellStart"/>
-      <w:r>
-        <w:t>in-game</w:t>
-      </w:r>
-      <w:proofErr w:type="spellEnd"/>
-      <w:r>
-        <w:t xml:space="preserve"> (diálogo Humano-Amuleto) y un título de nivel. Todos los textos del juego están en español.</w:t>
+        <w:lastRenderedPageBreak/>
+        <w:t>Cada nivel arranca con una intro in-game (diálogo Humano-Amuleto) y un título de nivel. Todos los textos del juego están en español.</w:t>
       </w:r>
     </w:p>
     <w:p>
@@ -1634,7 +1558,10 @@
         <w:spacing w:after="200" w:line="276" w:lineRule="auto"/>
       </w:pPr>
       <w:r>
-        <w:t>El juego está diseñado para PC y se controla con teclado o mando. Los controles son los mismos en todas las formas:</w:t>
+        <w:t>El juego está diseñado para PC y se controla con teclado o mando. Los controles son los mismos en todas las forma</w:t>
+      </w:r>
+      <w:r>
+        <w:t>s:</w:t>
       </w:r>
     </w:p>
     <w:p>
@@ -1654,15 +1581,7 @@
         <w:t xml:space="preserve">Mover - </w:t>
       </w:r>
       <w:r>
-        <w:t xml:space="preserve">A / D o flechas (mando: </w:t>
-      </w:r>
-      <w:proofErr w:type="spellStart"/>
-      <w:r>
-        <w:t>stick</w:t>
-      </w:r>
-      <w:proofErr w:type="spellEnd"/>
-      <w:r>
-        <w:t xml:space="preserve"> / cruz).</w:t>
+        <w:t>A / D (mando: stick izquierdo).</w:t>
       </w:r>
     </w:p>
     <w:p>
@@ -1679,10 +1598,10 @@
           <w:b/>
           <w:bCs/>
         </w:rPr>
-        <w:t xml:space="preserve">Saltar - </w:t>
-      </w:r>
-      <w:r>
-        <w:t>Espacio (mando: A).</w:t>
+        <w:t xml:space="preserve">Cámara - </w:t>
+      </w:r>
+      <w:r>
+        <w:t>flechas (mando: stick derecho).</w:t>
       </w:r>
     </w:p>
     <w:p>
@@ -1699,13 +1618,10 @@
           <w:b/>
           <w:bCs/>
         </w:rPr>
-        <w:t xml:space="preserve">Golpe / Golpe fuerte / Especial e interactuar - </w:t>
-      </w:r>
-      <w:r>
-        <w:t>J / K / L (mando</w:t>
-      </w:r>
-      <w:r>
-        <w:t>: X / Y / B).</w:t>
+        <w:t xml:space="preserve">Saltar - </w:t>
+      </w:r>
+      <w:r>
+        <w:t>Espacio (mando: A).</w:t>
       </w:r>
     </w:p>
     <w:p>
@@ -1722,34 +1638,10 @@
           <w:b/>
           <w:bCs/>
         </w:rPr>
-        <w:t xml:space="preserve">Bloquear y </w:t>
-      </w:r>
-      <w:proofErr w:type="spellStart"/>
-      <w:r>
-        <w:rPr>
-          <w:b/>
-          <w:bCs/>
-        </w:rPr>
-        <w:t>parry</w:t>
-      </w:r>
-      <w:proofErr w:type="spellEnd"/>
-      <w:r>
-        <w:rPr>
-          <w:b/>
-          <w:bCs/>
-        </w:rPr>
-        <w:t xml:space="preserve"> (Humano) - </w:t>
-      </w:r>
-      <w:r>
-        <w:t xml:space="preserve">Shift (mando: LB), justo al recibir el golpe para hacer </w:t>
-      </w:r>
-      <w:proofErr w:type="spellStart"/>
-      <w:r>
-        <w:t>parry</w:t>
-      </w:r>
-      <w:proofErr w:type="spellEnd"/>
-      <w:r>
-        <w:t>.</w:t>
+        <w:t xml:space="preserve">Golpe / Golpe fuerte / Especial e interactuar - </w:t>
+      </w:r>
+      <w:r>
+        <w:t>J / K / L (mando: X / Y / B).</w:t>
       </w:r>
     </w:p>
     <w:p>
@@ -1766,10 +1658,10 @@
           <w:b/>
           <w:bCs/>
         </w:rPr>
-        <w:t xml:space="preserve">Aleteo y picada (Murciélago) - </w:t>
-      </w:r>
-      <w:r>
-        <w:t>Espacio en el aire y S / flecha abajo en el aire.</w:t>
+        <w:t xml:space="preserve">Bloquear y parry (Humano) - </w:t>
+      </w:r>
+      <w:r>
+        <w:t>Shift (mando: LB), justo al recibir el golpe para hacer parry.</w:t>
       </w:r>
     </w:p>
     <w:p>
@@ -1786,18 +1678,10 @@
           <w:b/>
           <w:bCs/>
         </w:rPr>
-        <w:t xml:space="preserve">Elegir forma - </w:t>
-      </w:r>
-      <w:r>
-        <w:t xml:space="preserve">Q / E (mando: </w:t>
-      </w:r>
-      <w:proofErr w:type="spellStart"/>
-      <w:r>
-        <w:t>Select</w:t>
-      </w:r>
-      <w:proofErr w:type="spellEnd"/>
-      <w:r>
-        <w:t>).</w:t>
+        <w:t xml:space="preserve">Aleteo y picada (Murciélago) - </w:t>
+      </w:r>
+      <w:r>
+        <w:t>Espacio en el aire y S en el aire (mando: A en el aire y stick hacia abajo).</w:t>
       </w:r>
     </w:p>
     <w:p>
@@ -1814,10 +1698,10 @@
           <w:b/>
           <w:bCs/>
         </w:rPr>
-        <w:t xml:space="preserve">Transformar o volver a Humano - </w:t>
-      </w:r>
-      <w:r>
-        <w:t>T (mando: RB).</w:t>
+        <w:t xml:space="preserve">Elegir forma - </w:t>
+      </w:r>
+      <w:r>
+        <w:t>Q / E (mando: LT o Select / RT).</w:t>
       </w:r>
     </w:p>
     <w:p>
@@ -1834,10 +1718,13 @@
           <w:b/>
           <w:bCs/>
         </w:rPr>
-        <w:t xml:space="preserve">Transformar directo (teclas) - </w:t>
-      </w:r>
-      <w:r>
-        <w:t>1 Humano / 2 Lobo / 3 Oso / 4 Murciélago.</w:t>
+        <w:t xml:space="preserve">Transformar o volver a Humano - </w:t>
+      </w:r>
+      <w:r>
+        <w:t>T (ma</w:t>
+      </w:r>
+      <w:r>
+        <w:t>ndo: RB).</w:t>
       </w:r>
     </w:p>
     <w:p>
@@ -1854,149 +1741,10 @@
           <w:b/>
           <w:bCs/>
         </w:rPr>
-        <w:t xml:space="preserve">Pausa - </w:t>
-      </w:r>
-      <w:proofErr w:type="spellStart"/>
-      <w:r>
-        <w:t>Esc</w:t>
-      </w:r>
-      <w:proofErr w:type="spellEnd"/>
-      <w:r>
-        <w:t xml:space="preserve"> (mando: </w:t>
-      </w:r>
-      <w:proofErr w:type="spellStart"/>
-      <w:r>
-        <w:t>Start</w:t>
-      </w:r>
-      <w:proofErr w:type="spellEnd"/>
-      <w:r>
-        <w:t>).</w:t>
-      </w:r>
-    </w:p>
-    <w:p>
-      <w:pPr>
-        <w:spacing w:before="120"/>
-      </w:pPr>
-      <w:r>
-        <w:t>Combo: golpe ligero seguido de golpe fuerte (J, K). El juego guarda la segunda pulsación para que no se exija precisión extrema.</w:t>
-      </w:r>
-    </w:p>
-    <w:p>
-      <w:pPr>
-        <w:pStyle w:val="Ttulo2"/>
-        <w:keepNext/>
-        <w:spacing w:before="200" w:after="240"/>
-        <w:jc w:val="center"/>
-      </w:pPr>
-      <w:proofErr w:type="spellStart"/>
-      <w:r>
-        <w:t>Gameplay</w:t>
-      </w:r>
-      <w:proofErr w:type="spellEnd"/>
-    </w:p>
-    <w:p>
-      <w:pPr>
-        <w:spacing w:after="200" w:line="276" w:lineRule="auto"/>
-      </w:pPr>
-      <w:r>
-        <w:rPr>
-          <w:b/>
-          <w:bCs/>
-        </w:rPr>
-        <w:t>Mo</w:t>
-      </w:r>
-      <w:r>
-        <w:rPr>
-          <w:b/>
-          <w:bCs/>
-        </w:rPr>
-        <w:t xml:space="preserve">vimiento: </w:t>
-      </w:r>
-      <w:r>
-        <w:t>el jugador recorre el nivel de izquierda a derecha con salto, coyote time y buffer de salto. Cada forma tiene inercia y peso propios.</w:t>
-      </w:r>
-    </w:p>
-    <w:p>
-      <w:pPr>
-        <w:spacing w:after="200" w:line="276" w:lineRule="auto"/>
-      </w:pPr>
-      <w:r>
-        <w:rPr>
-          <w:b/>
-          <w:bCs/>
-        </w:rPr>
-        <w:t xml:space="preserve">Combate: </w:t>
-      </w:r>
-      <w:r>
-        <w:t xml:space="preserve">golpe ligero, fuerte y especial. Ligero + fuerte ejecuta el combo de la forma. El Humano bloquea (solo </w:t>
-      </w:r>
-      <w:r>
-        <w:t xml:space="preserve">de frente) y puede hacer </w:t>
-      </w:r>
-      <w:proofErr w:type="spellStart"/>
-      <w:r>
-        <w:t>parry</w:t>
-      </w:r>
-      <w:proofErr w:type="spellEnd"/>
-      <w:r>
-        <w:t xml:space="preserve"> con el timing justo, que devuelve proyectiles y da energía.</w:t>
-      </w:r>
-    </w:p>
-    <w:p>
-      <w:pPr>
-        <w:spacing w:after="200" w:line="276" w:lineRule="auto"/>
-      </w:pPr>
-      <w:r>
-        <w:rPr>
-          <w:b/>
-          <w:bCs/>
-        </w:rPr>
-        <w:t xml:space="preserve">Vida: </w:t>
-      </w:r>
-      <w:r>
-        <w:t>las cuatro formas comparten una única barra de vida (100). Los orbes de vida curan 24.</w:t>
-      </w:r>
-    </w:p>
-    <w:p>
-      <w:pPr>
-        <w:spacing w:after="200" w:line="276" w:lineRule="auto"/>
-      </w:pPr>
-      <w:r>
-        <w:rPr>
-          <w:b/>
-          <w:bCs/>
-        </w:rPr>
-        <w:t xml:space="preserve">Arenas: </w:t>
-      </w:r>
-      <w:r>
-        <w:t>al entrar a una zona de combate se cierran las paredes y aparece</w:t>
-      </w:r>
-      <w:r>
-        <w:t>n oleadas de enemigos. Al vencerlas se abre el camino.</w:t>
-      </w:r>
-    </w:p>
-    <w:p>
-      <w:pPr>
-        <w:spacing w:after="200" w:line="276" w:lineRule="auto"/>
-      </w:pPr>
-      <w:proofErr w:type="spellStart"/>
-      <w:r>
-        <w:rPr>
-          <w:b/>
-          <w:bCs/>
-        </w:rPr>
-        <w:t>Puzzles</w:t>
-      </w:r>
-      <w:proofErr w:type="spellEnd"/>
-      <w:r>
-        <w:rPr>
-          <w:b/>
-          <w:bCs/>
-        </w:rPr>
-        <w:t xml:space="preserve"> por forma: </w:t>
-      </w:r>
-      <w:r>
-        <w:t>los obstáculos muestran el símbolo de la forma necesaria:</w:t>
+        <w:t xml:space="preserve">Transformar directo - </w:t>
+      </w:r>
+      <w:r>
+        <w:t>1 Humano / 2 Lobo / 3 Oso / 4 Murciélago (mando, cruceta: izquierda Oso, derecha Lobo, arriba Murciélago, abajo Humano).</w:t>
       </w:r>
     </w:p>
     <w:p>
@@ -2013,19 +1761,10 @@
           <w:b/>
           <w:bCs/>
         </w:rPr>
-        <w:lastRenderedPageBreak/>
-        <w:t xml:space="preserve">Lobo - </w:t>
-      </w:r>
-      <w:r>
-        <w:t xml:space="preserve">enredaderas y muros </w:t>
-      </w:r>
-      <w:proofErr w:type="spellStart"/>
-      <w:r>
-        <w:t>trepables</w:t>
-      </w:r>
-      <w:proofErr w:type="spellEnd"/>
-      <w:r>
-        <w:t>, túneles bajos.</w:t>
+        <w:t xml:space="preserve">Adelantar diálogo - </w:t>
+      </w:r>
+      <w:r>
+        <w:t>Enter (mando: L3).</w:t>
       </w:r>
     </w:p>
     <w:p>
@@ -2042,10 +1781,10 @@
           <w:b/>
           <w:bCs/>
         </w:rPr>
-        <w:t xml:space="preserve">Murciélago - </w:t>
-      </w:r>
-      <w:r>
-        <w:t>cristales de barrera que solo rompe el proyectil sónico.</w:t>
+        <w:t xml:space="preserve">Omitir cinemática o intro - </w:t>
+      </w:r>
+      <w:r>
+        <w:t>X, manteniéndola presionada.</w:t>
       </w:r>
     </w:p>
     <w:p>
@@ -2062,63 +1801,239 @@
           <w:b/>
           <w:bCs/>
         </w:rPr>
-        <w:t xml:space="preserve">Oso - </w:t>
-      </w:r>
-      <w:r>
-        <w:t>losas de peso y muros de piedra que solo él rompe o activa.</w:t>
-      </w:r>
-    </w:p>
-    <w:p>
-      <w:pPr>
-        <w:spacing w:after="200" w:line="276" w:lineRule="auto"/>
-      </w:pPr>
-      <w:r>
-        <w:rPr>
-          <w:b/>
-          <w:bCs/>
-        </w:rPr>
-        <w:t xml:space="preserve">Peligros: </w:t>
-      </w:r>
-      <w:r>
-        <w:t>pinchos, pozos, plataformas frágiles y derrumbes.</w:t>
-      </w:r>
-    </w:p>
-    <w:p>
-      <w:pPr>
-        <w:spacing w:after="200" w:line="276" w:lineRule="auto"/>
-      </w:pPr>
-      <w:r>
-        <w:rPr>
-          <w:b/>
-          <w:bCs/>
-        </w:rPr>
-        <w:t xml:space="preserve">Muerte y reaparición: </w:t>
-      </w:r>
-      <w:r>
-        <w:t xml:space="preserve">al morir se reaparece en el último </w:t>
-      </w:r>
-      <w:proofErr w:type="spellStart"/>
-      <w:r>
-        <w:t>checkpoint</w:t>
-      </w:r>
-      <w:proofErr w:type="spellEnd"/>
-      <w:r>
-        <w:t xml:space="preserve"> (sant</w:t>
-      </w:r>
-      <w:r>
-        <w:t>uario) del nivel. No hay límite de intentos.</w:t>
+        <w:t>Pausa -</w:t>
+      </w:r>
+      <w:r>
+        <w:rPr>
+          <w:b/>
+          <w:bCs/>
+        </w:rPr>
+        <w:t xml:space="preserve"> </w:t>
+      </w:r>
+      <w:r>
+        <w:t>Esc (mando: Start).</w:t>
+      </w:r>
+    </w:p>
+    <w:p>
+      <w:pPr>
+        <w:spacing w:before="120"/>
+      </w:pPr>
+      <w:r>
+        <w:t>Combo: golpe ligero seguido de golpe fuerte (J, K). El juego guarda la segunda pulsación para que no se exija precisión extrema.</w:t>
       </w:r>
     </w:p>
     <w:p>
       <w:pPr>
         <w:pStyle w:val="Ttulo2"/>
         <w:keepNext/>
-        <w:pageBreakBefore/>
         <w:spacing w:before="200" w:after="240"/>
         <w:jc w:val="center"/>
       </w:pPr>
       <w:r>
+        <w:t>Gameplay</w:t>
+      </w:r>
+    </w:p>
+    <w:p>
+      <w:pPr>
+        <w:spacing w:after="200" w:line="276" w:lineRule="auto"/>
+      </w:pPr>
+      <w:r>
+        <w:rPr>
+          <w:b/>
+          <w:bCs/>
+        </w:rPr>
+        <w:t xml:space="preserve">Movimiento: </w:t>
+      </w:r>
+      <w:r>
+        <w:t>el jugador recorre el nivel de izquierda a derecha con salto, coyote time y buffer de salto. Cada forma tiene inercia y peso propios.</w:t>
+      </w:r>
+    </w:p>
+    <w:p>
+      <w:pPr>
+        <w:spacing w:after="200" w:line="276" w:lineRule="auto"/>
+      </w:pPr>
+      <w:r>
+        <w:rPr>
+          <w:b/>
+          <w:bCs/>
+        </w:rPr>
+        <w:t xml:space="preserve">Combate: </w:t>
+      </w:r>
+      <w:r>
+        <w:t>golpe ligero, fuerte y especial. Ligero + fuerte ejecuta el combo de la forma. El Humano bloquea (solo de frente)</w:t>
+      </w:r>
+      <w:r>
+        <w:t xml:space="preserve"> y puede hacer parry con el timing justo, que devuelve proyectiles y da energía.</w:t>
+      </w:r>
+    </w:p>
+    <w:p>
+      <w:pPr>
+        <w:spacing w:after="200" w:line="276" w:lineRule="auto"/>
+      </w:pPr>
+      <w:r>
+        <w:rPr>
+          <w:b/>
+          <w:bCs/>
+        </w:rPr>
+        <w:t xml:space="preserve">Vida: </w:t>
+      </w:r>
+      <w:r>
+        <w:t>las cuatro formas comparten una única barra de vida (100). Los orbes de vida curan 24.</w:t>
+      </w:r>
+    </w:p>
+    <w:p>
+      <w:pPr>
+        <w:spacing w:after="200" w:line="276" w:lineRule="auto"/>
+      </w:pPr>
+      <w:r>
+        <w:rPr>
+          <w:b/>
+          <w:bCs/>
+        </w:rPr>
+        <w:t xml:space="preserve">Arenas: </w:t>
+      </w:r>
+      <w:r>
+        <w:t xml:space="preserve">al entrar a una zona de combate se cierran las paredes y aparecen oleadas </w:t>
+      </w:r>
+      <w:r>
+        <w:t>de enemigos. Al vencerlas se abre el camino.</w:t>
+      </w:r>
+    </w:p>
+    <w:p>
+      <w:pPr>
+        <w:spacing w:after="200" w:line="276" w:lineRule="auto"/>
+        <w:rPr>
+          <w:b/>
+          <w:bCs/>
+        </w:rPr>
+      </w:pPr>
+    </w:p>
+    <w:p>
+      <w:pPr>
+        <w:spacing w:after="200" w:line="276" w:lineRule="auto"/>
+        <w:rPr>
+          <w:b/>
+          <w:bCs/>
+        </w:rPr>
+      </w:pPr>
+    </w:p>
+    <w:p>
+      <w:pPr>
+        <w:spacing w:after="200" w:line="276" w:lineRule="auto"/>
+      </w:pPr>
+      <w:r>
+        <w:rPr>
+          <w:b/>
+          <w:bCs/>
+        </w:rPr>
         <w:lastRenderedPageBreak/>
+        <w:t xml:space="preserve">Puzzles por forma: </w:t>
+      </w:r>
+      <w:r>
+        <w:t>los obstáculos muestran el símbolo de la forma necesaria:</w:t>
+      </w:r>
+    </w:p>
+    <w:p>
+      <w:pPr>
+        <w:pStyle w:val="Prrafodelista"/>
+        <w:numPr>
+          <w:ilvl w:val="0"/>
+          <w:numId w:val="2"/>
+        </w:numPr>
+        <w:spacing w:after="80" w:line="276" w:lineRule="auto"/>
+      </w:pPr>
+      <w:r>
+        <w:rPr>
+          <w:b/>
+          <w:bCs/>
+        </w:rPr>
+        <w:t xml:space="preserve">Lobo - </w:t>
+      </w:r>
+      <w:r>
+        <w:t>enredaderas y muros trepables, túneles bajos.</w:t>
+      </w:r>
+    </w:p>
+    <w:p>
+      <w:pPr>
+        <w:pStyle w:val="Prrafodelista"/>
+        <w:numPr>
+          <w:ilvl w:val="0"/>
+          <w:numId w:val="2"/>
+        </w:numPr>
+        <w:spacing w:after="80" w:line="276" w:lineRule="auto"/>
+      </w:pPr>
+      <w:r>
+        <w:rPr>
+          <w:b/>
+          <w:bCs/>
+        </w:rPr>
+        <w:t xml:space="preserve">Murciélago - </w:t>
+      </w:r>
+      <w:r>
+        <w:t>cristales de barrera que solo rompe el proyectil sónico.</w:t>
+      </w:r>
+    </w:p>
+    <w:p>
+      <w:pPr>
+        <w:pStyle w:val="Prrafodelista"/>
+        <w:numPr>
+          <w:ilvl w:val="0"/>
+          <w:numId w:val="2"/>
+        </w:numPr>
+        <w:spacing w:after="80" w:line="276" w:lineRule="auto"/>
+      </w:pPr>
+      <w:r>
+        <w:rPr>
+          <w:b/>
+          <w:bCs/>
+        </w:rPr>
+        <w:t xml:space="preserve">Oso - </w:t>
+      </w:r>
+      <w:r>
+        <w:t>losas</w:t>
+      </w:r>
+      <w:r>
+        <w:t xml:space="preserve"> de peso y muros de piedra que solo él rompe o activa.</w:t>
+      </w:r>
+    </w:p>
+    <w:p>
+      <w:pPr>
+        <w:spacing w:after="200" w:line="276" w:lineRule="auto"/>
+      </w:pPr>
+      <w:r>
+        <w:rPr>
+          <w:b/>
+          <w:bCs/>
+        </w:rPr>
+        <w:t xml:space="preserve">Peligros: </w:t>
+      </w:r>
+      <w:r>
+        <w:t>pinchos, pozos, plataformas frágiles y derrumbes.</w:t>
+      </w:r>
+    </w:p>
+    <w:p>
+      <w:pPr>
+        <w:spacing w:after="200" w:line="276" w:lineRule="auto"/>
+      </w:pPr>
+      <w:r>
+        <w:rPr>
+          <w:b/>
+          <w:bCs/>
+        </w:rPr>
+        <w:t xml:space="preserve">Muerte y reaparición: </w:t>
+      </w:r>
+      <w:r>
+        <w:t>al morir se reaparece en el último checkpoint (santuario) del nivel. No hay límite de intentos.</w:t>
+      </w:r>
+    </w:p>
+    <w:p>
+      <w:pPr>
+        <w:pStyle w:val="Ttulo2"/>
+        <w:keepNext/>
+        <w:spacing w:before="200" w:after="240"/>
+        <w:jc w:val="center"/>
+      </w:pPr>
+      <w:r>
         <w:t>Formas (personajes)</w:t>
       </w:r>
     </w:p>
@@ -2127,15 +2042,10 @@
         <w:spacing w:after="200" w:line="276" w:lineRule="auto"/>
       </w:pPr>
       <w:r>
-        <w:t xml:space="preserve">Contamos con 4 formas jugables que comparten la vida, pero tienen estadísticas distintas que afectan el </w:t>
-      </w:r>
-      <w:proofErr w:type="spellStart"/>
-      <w:r>
-        <w:t>gameplay</w:t>
-      </w:r>
-      <w:proofErr w:type="spellEnd"/>
-      <w:r>
-        <w:t>:</w:t>
+        <w:t>Con</w:t>
+      </w:r>
+      <w:r>
+        <w:t>tamos con 4 formas jugables que comparten la vida, pero tienen estadísticas distintas que afectan el gameplay:</w:t>
       </w:r>
     </w:p>
     <w:tbl>
@@ -2185,10 +2095,10 @@
                 <w:noProof/>
               </w:rPr>
               <w:drawing>
-                <wp:inline distT="0" distB="0" distL="0" distR="0" wp14:anchorId="5F36B943" wp14:editId="516E3833">
-                  <wp:extent cx="457200" cy="752475"/>
+                <wp:inline distT="0" distB="0" distL="0" distR="0" wp14:anchorId="16E83A8C" wp14:editId="661AC5BA">
+                  <wp:extent cx="457200" cy="742950"/>
                   <wp:effectExtent l="0" t="0" r="0" b="0"/>
-                  <wp:docPr id="10" name="s_humano.png" descr="s_humano.png" title="s_humano.png"/>
+                  <wp:docPr id="12" name="s_humano.png" descr="s_humano.png" title="s_humano.png"/>
                   <wp:cNvGraphicFramePr>
                     <a:graphicFrameLocks xmlns:a="http://schemas.openxmlformats.org/drawingml/2006/main" noChangeAspect="1"/>
                   </wp:cNvGraphicFramePr>
@@ -2202,7 +2112,7 @@
                           </pic:cNvPicPr>
                         </pic:nvPicPr>
                         <pic:blipFill>
-                          <a:blip r:embed="rId14"/>
+                          <a:blip r:embed="rId16"/>
                           <a:srcRect/>
                           <a:stretch>
                             <a:fillRect/>
@@ -2211,7 +2121,7 @@
                         <pic:spPr bwMode="auto">
                           <a:xfrm>
                             <a:off x="0" y="0"/>
-                            <a:ext cx="457200" cy="752475"/>
+                            <a:ext cx="457200" cy="742950"/>
                           </a:xfrm>
                           <a:prstGeom prst="rect">
                             <a:avLst/>
@@ -2254,23 +2164,7 @@
               <w:t xml:space="preserve">Humano: </w:t>
             </w:r>
             <w:r>
-              <w:t>Base (</w:t>
-            </w:r>
-            <w:proofErr w:type="spellStart"/>
-            <w:r>
-              <w:t>vel</w:t>
-            </w:r>
-            <w:proofErr w:type="spellEnd"/>
-            <w:r>
-              <w:t xml:space="preserve">. 600, daño 8/14/24) - Forma inicial. Bloquea y hace </w:t>
-            </w:r>
-            <w:proofErr w:type="spellStart"/>
-            <w:r>
-              <w:t>parry</w:t>
-            </w:r>
-            <w:proofErr w:type="spellEnd"/>
-            <w:r>
-              <w:t>. Combo: Remate.</w:t>
+              <w:t>Base (vel. 600, daño 8/14/24) - Forma inicial. Bloquea y hace parry. Combo: Remate.</w:t>
             </w:r>
           </w:p>
         </w:tc>
@@ -2305,10 +2199,10 @@
                 <w:noProof/>
               </w:rPr>
               <w:drawing>
-                <wp:inline distT="0" distB="0" distL="0" distR="0" wp14:anchorId="0C6ED5D8" wp14:editId="130E86BB">
+                <wp:inline distT="0" distB="0" distL="0" distR="0" wp14:anchorId="2C206B9B" wp14:editId="72CCD686">
                   <wp:extent cx="742950" cy="466725"/>
                   <wp:effectExtent l="0" t="0" r="0" b="0"/>
-                  <wp:docPr id="11" name="s_lobo.png" descr="s_lobo.png" title="s_lobo.png"/>
+                  <wp:docPr id="13" name="s_lobo.png" descr="s_lobo.png" title="s_lobo.png"/>
                   <wp:cNvGraphicFramePr>
                     <a:graphicFrameLocks xmlns:a="http://schemas.openxmlformats.org/drawingml/2006/main" noChangeAspect="1"/>
                   </wp:cNvGraphicFramePr>
@@ -2322,7 +2216,7 @@
                           </pic:cNvPicPr>
                         </pic:nvPicPr>
                         <pic:blipFill>
-                          <a:blip r:embed="rId15"/>
+                          <a:blip r:embed="rId17"/>
                           <a:srcRect/>
                           <a:stretch>
                             <a:fillRect/>
@@ -2374,15 +2268,7 @@
               <w:t xml:space="preserve">Lobo: </w:t>
             </w:r>
             <w:r>
-              <w:t>Veloz (</w:t>
-            </w:r>
-            <w:proofErr w:type="spellStart"/>
-            <w:r>
-              <w:t>vel</w:t>
-            </w:r>
-            <w:proofErr w:type="spellEnd"/>
-            <w:r>
-              <w:t>. 690, daño 8/13/26) - Doble salto, trepa muros y cruza túneles bajos. Combo: Embestida.</w:t>
+              <w:t>Veloz (vel. 690, daño 8/13/26) - Doble salto, trepa muros y cruza túneles bajos. Combo: Embestida.</w:t>
             </w:r>
           </w:p>
         </w:tc>
@@ -2417,10 +2303,10 @@
                 <w:noProof/>
               </w:rPr>
               <w:drawing>
-                <wp:inline distT="0" distB="0" distL="0" distR="0" wp14:anchorId="2F535D72" wp14:editId="2C34AA05">
+                <wp:inline distT="0" distB="0" distL="0" distR="0" wp14:anchorId="374EBBE1" wp14:editId="628A817A">
                   <wp:extent cx="438150" cy="581025"/>
                   <wp:effectExtent l="0" t="0" r="0" b="0"/>
-                  <wp:docPr id="12" name="s_murci.png" descr="s_murci.png" title="s_murci.png"/>
+                  <wp:docPr id="14" name="s_murci.png" descr="s_murci.png" title="s_murci.png"/>
                   <wp:cNvGraphicFramePr>
                     <a:graphicFrameLocks xmlns:a="http://schemas.openxmlformats.org/drawingml/2006/main" noChangeAspect="1"/>
                   </wp:cNvGraphicFramePr>
@@ -2434,7 +2320,7 @@
                           </pic:cNvPicPr>
                         </pic:nvPicPr>
                         <pic:blipFill>
-                          <a:blip r:embed="rId16"/>
+                          <a:blip r:embed="rId18"/>
                           <a:srcRect/>
                           <a:stretch>
                             <a:fillRect/>
@@ -2486,15 +2372,7 @@
               <w:t xml:space="preserve">Murciélago: </w:t>
             </w:r>
             <w:r>
-              <w:t>Aéreo (</w:t>
-            </w:r>
-            <w:proofErr w:type="spellStart"/>
-            <w:r>
-              <w:t>vel</w:t>
-            </w:r>
-            <w:proofErr w:type="spellEnd"/>
-            <w:r>
-              <w:t xml:space="preserve">. 420, daño 9/14/15) - Planea, aletea, </w:t>
+              <w:t xml:space="preserve">Aéreo (vel. 420, daño 9/14/15) - Planea, aletea, </w:t>
             </w:r>
             <w:r>
               <w:t>pica hacia abajo y dispara un proyectil sónico que rompe cristales. Combo: Ala Cortante.</w:t>
@@ -2532,10 +2410,10 @@
                 <w:noProof/>
               </w:rPr>
               <w:drawing>
-                <wp:inline distT="0" distB="0" distL="0" distR="0" wp14:anchorId="7B6B3FDB" wp14:editId="5C7D9DAE">
+                <wp:inline distT="0" distB="0" distL="0" distR="0" wp14:anchorId="7695FDE2" wp14:editId="7339BBC3">
                   <wp:extent cx="762000" cy="533400"/>
                   <wp:effectExtent l="0" t="0" r="0" b="0"/>
-                  <wp:docPr id="13" name="s_oso.png" descr="s_oso.png" title="s_oso.png"/>
+                  <wp:docPr id="15" name="s_oso.png" descr="s_oso.png" title="s_oso.png"/>
                   <wp:cNvGraphicFramePr>
                     <a:graphicFrameLocks xmlns:a="http://schemas.openxmlformats.org/drawingml/2006/main" noChangeAspect="1"/>
                   </wp:cNvGraphicFramePr>
@@ -2549,7 +2427,7 @@
                           </pic:cNvPicPr>
                         </pic:nvPicPr>
                         <pic:blipFill>
-                          <a:blip r:embed="rId17"/>
+                          <a:blip r:embed="rId19"/>
                           <a:srcRect/>
                           <a:stretch>
                             <a:fillRect/>
@@ -2601,23 +2479,7 @@
               <w:t xml:space="preserve">Oso: </w:t>
             </w:r>
             <w:r>
-              <w:t>Pesado (</w:t>
-            </w:r>
-            <w:proofErr w:type="spellStart"/>
-            <w:r>
-              <w:t>vel</w:t>
-            </w:r>
-            <w:proofErr w:type="spellEnd"/>
-            <w:r>
-              <w:t xml:space="preserve">. 350, daño 16/24/32) - Lento pero devastador. </w:t>
-            </w:r>
-            <w:proofErr w:type="gramStart"/>
-            <w:r>
-              <w:t>Activa losas</w:t>
-            </w:r>
-            <w:proofErr w:type="gramEnd"/>
-            <w:r>
-              <w:t xml:space="preserve"> de peso y rompe muros de piedra. Combo: Garra.</w:t>
+              <w:t>Pesado (vel. 350, daño 16/24/32) - Lento pero devastador. Activa losas de peso y rompe muros de piedra. Combo: Garra.</w:t>
             </w:r>
           </w:p>
         </w:tc>
@@ -2656,6 +2518,13 @@
       <w:r>
         <w:t>el collar de los espíritus acompaña al jugador con globos de diálogo: cuenta la historia, aconseja y reacciona a lo que ocurre.</w:t>
       </w:r>
+    </w:p>
+    <w:p>
+      <w:pPr>
+        <w:pStyle w:val="Ttulo3"/>
+        <w:keepNext/>
+        <w:spacing w:before="200" w:after="160"/>
+      </w:pPr>
     </w:p>
     <w:p>
       <w:pPr>
@@ -2714,10 +2583,10 @@
                 <w:noProof/>
               </w:rPr>
               <w:drawing>
-                <wp:inline distT="0" distB="0" distL="0" distR="0" wp14:anchorId="5A17166B" wp14:editId="42C3EA87">
+                <wp:inline distT="0" distB="0" distL="0" distR="0" wp14:anchorId="08E52101" wp14:editId="592FCBE6">
                   <wp:extent cx="342900" cy="1028700"/>
                   <wp:effectExtent l="0" t="0" r="0" b="0"/>
-                  <wp:docPr id="14" name="s_cultista.png" descr="s_cultista.png" title="s_cultista.png"/>
+                  <wp:docPr id="16" name="s_cultista.png" descr="s_cultista.png" title="s_cultista.png"/>
                   <wp:cNvGraphicFramePr>
                     <a:graphicFrameLocks xmlns:a="http://schemas.openxmlformats.org/drawingml/2006/main" noChangeAspect="1"/>
                   </wp:cNvGraphicFramePr>
@@ -2731,7 +2600,7 @@
                           </pic:cNvPicPr>
                         </pic:nvPicPr>
                         <pic:blipFill>
-                          <a:blip r:embed="rId18"/>
+                          <a:blip r:embed="rId20"/>
                           <a:srcRect/>
                           <a:stretch>
                             <a:fillRect/>
@@ -2775,21 +2644,12 @@
             <w:pPr>
               <w:spacing w:after="60" w:line="276" w:lineRule="auto"/>
             </w:pPr>
-            <w:proofErr w:type="spellStart"/>
             <w:r>
               <w:rPr>
                 <w:b/>
                 <w:bCs/>
               </w:rPr>
-              <w:t>Cultista</w:t>
-            </w:r>
-            <w:proofErr w:type="spellEnd"/>
-            <w:r>
-              <w:rPr>
-                <w:b/>
-                <w:bCs/>
-              </w:rPr>
-              <w:t xml:space="preserve">: </w:t>
+              <w:t xml:space="preserve">Cultista: </w:t>
             </w:r>
             <w:r>
               <w:t>vida 75, daño 10 - Cuerpo a cuerpo. Persigue al jugador, se prepara con una anticipación visible y se lanza</w:t>
@@ -2830,10 +2690,10 @@
                 <w:noProof/>
               </w:rPr>
               <w:drawing>
-                <wp:inline distT="0" distB="0" distL="0" distR="0" wp14:anchorId="710906D8" wp14:editId="02588974">
+                <wp:inline distT="0" distB="0" distL="0" distR="0" wp14:anchorId="19AE1AA9" wp14:editId="474192A5">
                   <wp:extent cx="285750" cy="1143000"/>
                   <wp:effectExtent l="0" t="0" r="0" b="0"/>
-                  <wp:docPr id="15" name="s_arquero.png" descr="s_arquero.png" title="s_arquero.png"/>
+                  <wp:docPr id="17" name="s_arquero.png" descr="s_arquero.png" title="s_arquero.png"/>
                   <wp:cNvGraphicFramePr>
                     <a:graphicFrameLocks xmlns:a="http://schemas.openxmlformats.org/drawingml/2006/main" noChangeAspect="1"/>
                   </wp:cNvGraphicFramePr>
@@ -2847,7 +2707,7 @@
                           </pic:cNvPicPr>
                         </pic:nvPicPr>
                         <pic:blipFill>
-                          <a:blip r:embed="rId19"/>
+                          <a:blip r:embed="rId21"/>
                           <a:srcRect/>
                           <a:stretch>
                             <a:fillRect/>
@@ -2910,10 +2770,10 @@
         <w:spacing w:before="160"/>
       </w:pPr>
       <w:r>
-        <w:t>Los ataques enemigos se telegra</w:t>
-      </w:r>
-      <w:r>
-        <w:t>fían con un destello y un breve retroceso, para que el jugador pueda leerlos y reaccionar.</w:t>
+        <w:t>Los ataques enemigos se telegrafían con un destello y un breve retroceso, para que el</w:t>
+      </w:r>
+      <w:r>
+        <w:t xml:space="preserve"> jugador pueda leerlos y reaccionar.</w:t>
       </w:r>
     </w:p>
     <w:p>
@@ -2924,7 +2784,6 @@
         <w:jc w:val="center"/>
       </w:pPr>
       <w:r>
-        <w:lastRenderedPageBreak/>
         <w:t>Progresión y Energía</w:t>
       </w:r>
     </w:p>
@@ -2973,15 +2832,7 @@
         <w:t xml:space="preserve">Energía: </w:t>
       </w:r>
       <w:r>
-        <w:t xml:space="preserve">se gasta al transformarse (4 por segundo) y se recarga con almas de energía, enemigos derrotados y </w:t>
-      </w:r>
-      <w:proofErr w:type="spellStart"/>
-      <w:r>
-        <w:t>parrys</w:t>
-      </w:r>
-      <w:proofErr w:type="spellEnd"/>
-      <w:r>
-        <w:t xml:space="preserve"> exitosos.</w:t>
+        <w:t>se gasta al transformarse (4 por segundo) y se recarga con almas de energía, enemigos derrotados y parrys exitosos.</w:t>
       </w:r>
     </w:p>
     <w:p>
@@ -2995,25 +2846,134 @@
         <w:t>Jefe final</w:t>
       </w:r>
     </w:p>
-    <w:p>
-      <w:pPr>
-        <w:spacing w:after="200" w:line="276" w:lineRule="auto"/>
-      </w:pPr>
-      <w:r>
-        <w:t xml:space="preserve">El </w:t>
-      </w:r>
-      <w:proofErr w:type="gramStart"/>
-      <w:r>
-        <w:t>Arzobispo</w:t>
-      </w:r>
-      <w:proofErr w:type="gramEnd"/>
-      <w:r>
-        <w:t xml:space="preserve"> es el líder de la secta, ya transformado: una estrella de ocho puntas con un ojo central, unida al piso por un tallo. Nunca se le pega al cuerpo directamente; hay que atacar sus puntas y su ojo en cada fase. Al derrotarlo, el niño sale de aden</w:t>
-      </w:r>
-      <w:r>
-        <w:t>tro de él.</w:t>
-      </w:r>
-    </w:p>
+    <w:tbl>
+      <w:tblPr>
+        <w:tblW w:w="8640" w:type="dxa"/>
+        <w:tblBorders>
+          <w:top w:val="none" w:sz="0" w:space="0" w:color="FFFFFF"/>
+          <w:left w:val="none" w:sz="0" w:space="0" w:color="FFFFFF"/>
+          <w:bottom w:val="none" w:sz="0" w:space="0" w:color="FFFFFF"/>
+          <w:right w:val="none" w:sz="0" w:space="0" w:color="FFFFFF"/>
+          <w:insideH w:val="none" w:sz="0" w:space="0" w:color="FFFFFF"/>
+          <w:insideV w:val="none" w:sz="0" w:space="0" w:color="FFFFFF"/>
+        </w:tblBorders>
+        <w:tblLook w:val="04A0" w:firstRow="1" w:lastRow="0" w:firstColumn="1" w:lastColumn="0" w:noHBand="0" w:noVBand="1"/>
+      </w:tblPr>
+      <w:tblGrid>
+        <w:gridCol w:w="1770"/>
+        <w:gridCol w:w="6870"/>
+      </w:tblGrid>
+      <w:tr>
+        <w:trPr>
+          <w:cantSplit/>
+        </w:trPr>
+        <w:tc>
+          <w:tcPr>
+            <w:tcW w:w="1700" w:type="dxa"/>
+            <w:tcBorders>
+              <w:top w:val="none" w:sz="0" w:space="0" w:color="FFFFFF"/>
+              <w:left w:val="none" w:sz="0" w:space="0" w:color="FFFFFF"/>
+              <w:bottom w:val="none" w:sz="0" w:space="0" w:color="FFFFFF"/>
+              <w:right w:val="none" w:sz="0" w:space="0" w:color="FFFFFF"/>
+            </w:tcBorders>
+            <w:tcMar>
+              <w:top w:w="40" w:type="dxa"/>
+              <w:left w:w="0" w:type="dxa"/>
+              <w:bottom w:w="40" w:type="dxa"/>
+              <w:right w:w="120" w:type="dxa"/>
+            </w:tcMar>
+            <w:vAlign w:val="center"/>
+          </w:tcPr>
+          <w:p>
+            <w:pPr>
+              <w:jc w:val="center"/>
+            </w:pPr>
+            <w:r>
+              <w:rPr>
+                <w:noProof/>
+              </w:rPr>
+              <w:drawing>
+                <wp:inline distT="0" distB="0" distL="0" distR="0" wp14:anchorId="39A3A832" wp14:editId="5678615A">
+                  <wp:extent cx="1047750" cy="742950"/>
+                  <wp:effectExtent l="0" t="0" r="0" b="0"/>
+                  <wp:docPr id="18" name="s_jefe.png" descr="s_jefe.png" title="s_jefe.png"/>
+                  <wp:cNvGraphicFramePr>
+                    <a:graphicFrameLocks xmlns:a="http://schemas.openxmlformats.org/drawingml/2006/main" noChangeAspect="1"/>
+                  </wp:cNvGraphicFramePr>
+                  <a:graphic xmlns:a="http://schemas.openxmlformats.org/drawingml/2006/main">
+                    <a:graphicData uri="http://schemas.openxmlformats.org/drawingml/2006/picture">
+                      <pic:pic xmlns:pic="http://schemas.openxmlformats.org/drawingml/2006/picture">
+                        <pic:nvPicPr>
+                          <pic:cNvPr id="0" name=""/>
+                          <pic:cNvPicPr>
+                            <a:picLocks noChangeAspect="1" noChangeArrowheads="1"/>
+                          </pic:cNvPicPr>
+                        </pic:nvPicPr>
+                        <pic:blipFill>
+                          <a:blip r:embed="rId22"/>
+                          <a:srcRect/>
+                          <a:stretch>
+                            <a:fillRect/>
+                          </a:stretch>
+                        </pic:blipFill>
+                        <pic:spPr bwMode="auto">
+                          <a:xfrm>
+                            <a:off x="0" y="0"/>
+                            <a:ext cx="1047750" cy="742950"/>
+                          </a:xfrm>
+                          <a:prstGeom prst="rect">
+                            <a:avLst/>
+                          </a:prstGeom>
+                        </pic:spPr>
+                      </pic:pic>
+                    </a:graphicData>
+                  </a:graphic>
+                </wp:inline>
+              </w:drawing>
+            </w:r>
+          </w:p>
+        </w:tc>
+        <w:tc>
+          <w:tcPr>
+            <w:tcW w:w="6940" w:type="dxa"/>
+            <w:tcBorders>
+              <w:top w:val="none" w:sz="0" w:space="0" w:color="FFFFFF"/>
+              <w:left w:val="none" w:sz="0" w:space="0" w:color="FFFFFF"/>
+              <w:bottom w:val="none" w:sz="0" w:space="0" w:color="FFFFFF"/>
+              <w:right w:val="none" w:sz="0" w:space="0" w:color="FFFFFF"/>
+            </w:tcBorders>
+            <w:tcMar>
+              <w:top w:w="40" w:type="dxa"/>
+              <w:left w:w="120" w:type="dxa"/>
+              <w:bottom w:w="40" w:type="dxa"/>
+              <w:right w:w="0" w:type="dxa"/>
+            </w:tcMar>
+            <w:vAlign w:val="center"/>
+          </w:tcPr>
+          <w:p>
+            <w:pPr>
+              <w:spacing w:after="60" w:line="276" w:lineRule="auto"/>
+            </w:pPr>
+            <w:r>
+              <w:rPr>
+                <w:b/>
+                <w:bCs/>
+              </w:rPr>
+              <w:t xml:space="preserve">Arzobispo: </w:t>
+            </w:r>
+            <w:r>
+              <w:t>vida 450 (150 por fase) - Líder de la secta, ya transfo</w:t>
+            </w:r>
+            <w:r>
+              <w:t>rmado: una estrella de siete puntas con un ojo central, unida al piso por un tallo. La cabeza nunca se rompe: la vida se lee en el ojo, que se llena de venas al recibir daño. Solo se lo daña cuando muestra el ojo, y cada fase pide una forma distinta. Al de</w:t>
+            </w:r>
+            <w:r>
+              <w:t>rrotarlo, el niño sale de adentro de él.</w:t>
+            </w:r>
+          </w:p>
+        </w:tc>
+      </w:tr>
+    </w:tbl>
     <w:p>
       <w:pPr>
         <w:pStyle w:val="Prrafodelista"/>
@@ -3031,15 +2991,7 @@
         <w:t xml:space="preserve">Fase 1 - </w:t>
       </w:r>
       <w:r>
-        <w:t xml:space="preserve">aparecen llaves en el tallo; el Oso debe romper el nudo del tallo (golpe ≥ 24, 3 golpes) para bajar el ojo y poder dañarlo. El jefe lanza tajos con aviso que el Humano puede devolver con </w:t>
-      </w:r>
-      <w:proofErr w:type="spellStart"/>
-      <w:r>
-        <w:t>parry</w:t>
-      </w:r>
-      <w:proofErr w:type="spellEnd"/>
-      <w:r>
-        <w:t>.</w:t>
+        <w:t>los ojos satélite disparan rayos con aviso, que el Humano puede devolver con parry. El Oso debe romper con un golpe fuerte el círculo del nudo del tallo para bajar el ojo central y poder dañarlo.</w:t>
       </w:r>
     </w:p>
     <w:p>
@@ -3059,18 +3011,10 @@
         <w:t xml:space="preserve">Fase 2 - </w:t>
       </w:r>
       <w:r>
-        <w:t>el piso se rompe y cae al foso; e</w:t>
-      </w:r>
-      <w:r>
-        <w:t xml:space="preserve">l Lobo cruza el pozo y el Murciélago alcanza el ojo alto. Aparecen torretas (ojos acorazados que solo rompe el Oso) y barridos de luz que hay que esquivar o </w:t>
-      </w:r>
-      <w:proofErr w:type="spellStart"/>
-      <w:r>
-        <w:t>parryear</w:t>
-      </w:r>
-      <w:proofErr w:type="spellEnd"/>
-      <w:r>
-        <w:t>.</w:t>
+        <w:t>la sala se abre con plataformas a los lados y ojos flotantes por tandas a distintas alturas: el Lobo y el Humano alcanzan los bajos y el Murciélago los altos (su sónico los cierra). Las torretas acorazadas solo las rompe el Oso. Hay rayos finos y un rayo g</w:t>
+      </w:r>
+      <w:r>
+        <w:t>rueso que se esquiva o se devuelve con parry.</w:t>
       </w:r>
     </w:p>
     <w:p>
@@ -3087,32 +3031,25 @@
           <w:b/>
           <w:bCs/>
         </w:rPr>
+        <w:lastRenderedPageBreak/>
         <w:t xml:space="preserve">Fase 3 - </w:t>
       </w:r>
       <w:r>
-        <w:t>la estrella se arranca del tallo y se clava de punta; el Oso la arranca y los oj</w:t>
-      </w:r>
-      <w:r>
-        <w:t>os caen con coraza (solo el Oso la rompe). Es el duelo directo, sin ojos flotantes.</w:t>
-      </w:r>
-    </w:p>
-    <w:p>
-      <w:pPr>
-        <w:spacing w:before="120"/>
-      </w:pPr>
-      <w:r>
-        <w:t xml:space="preserve">Tiene 600 puntos de vida (200 por fase) y se corrompe al bajar de 66 % y de 33 %: más ataques, orbes más frecuentes y el latido acelera. Los orbes se pueden devolver con </w:t>
-      </w:r>
-      <w:proofErr w:type="spellStart"/>
-      <w:r>
-        <w:t>pa</w:t>
-      </w:r>
-      <w:r>
-        <w:t>rry</w:t>
-      </w:r>
-      <w:proofErr w:type="spellEnd"/>
-      <w:r>
-        <w:t>. Entre fases hay valles sin ataques para respirar.</w:t>
+        <w:t>la estrella se arranca del tallo y se clava de punta; absorbe a tres cultistas y ataca en combos (picada, embestida, orbes y estalactitas). Al agotarse cierra el ojo tras un caparazón que solo el Oso rompe, y a veces el niño aparece como escudo: ahí el pad</w:t>
+      </w:r>
+      <w:r>
+        <w:t>re no debe atacar.</w:t>
+      </w:r>
+    </w:p>
+    <w:p>
+      <w:pPr>
+        <w:spacing w:before="120" w:after="200" w:line="276" w:lineRule="auto"/>
+      </w:pPr>
+      <w:r>
+        <w:t>Cambia de fase al bajar de 66 % y de 33 % de vida: más ataques y el latido de la sala se acelera. Al cambiar de fase aparece un orbe de vida, y durante la pelea la energía se gasta mucho más lento (“el Amuleto arde”). Entre ataques hay v</w:t>
+      </w:r>
+      <w:r>
+        <w:t>alles para respirar.</w:t>
       </w:r>
     </w:p>
     <w:p>
@@ -3120,12 +3057,206 @@
         <w:spacing w:after="200" w:line="276" w:lineRule="auto"/>
       </w:pPr>
       <w:r>
-        <w:t>Entrada: el jefe no se muestra de entrada; al llegar a la arena emerge desde atrás y abajo, temblando, entre polvo y piedras del techo. Muerte: estalla con grietas de luz y el hijo aparece desde adentr</w:t>
-      </w:r>
-      <w:r>
-        <w:t>o, mientras el padre (Humano) lo contiene.</w:t>
-      </w:r>
-    </w:p>
+        <w:t>Entrada: el jefe no se muestra de entrada; al llegar a la arena emerge desde atrás y abajo, temblando, entre polvo y piedras del techo. Muerte: estalla en grietas de luz, corte a blanco y negro y comienza el cómic final.</w:t>
+      </w:r>
+    </w:p>
+    <w:tbl>
+      <w:tblPr>
+        <w:tblW w:w="8640" w:type="dxa"/>
+        <w:tblBorders>
+          <w:top w:val="none" w:sz="0" w:space="0" w:color="FFFFFF"/>
+          <w:left w:val="none" w:sz="0" w:space="0" w:color="FFFFFF"/>
+          <w:bottom w:val="none" w:sz="0" w:space="0" w:color="FFFFFF"/>
+          <w:right w:val="none" w:sz="0" w:space="0" w:color="FFFFFF"/>
+          <w:insideH w:val="none" w:sz="0" w:space="0" w:color="FFFFFF"/>
+          <w:insideV w:val="none" w:sz="0" w:space="0" w:color="FFFFFF"/>
+        </w:tblBorders>
+        <w:tblLook w:val="04A0" w:firstRow="1" w:lastRow="0" w:firstColumn="1" w:lastColumn="0" w:noHBand="0" w:noVBand="1"/>
+      </w:tblPr>
+      <w:tblGrid>
+        <w:gridCol w:w="4320"/>
+        <w:gridCol w:w="4320"/>
+      </w:tblGrid>
+      <w:tr>
+        <w:trPr>
+          <w:cantSplit/>
+        </w:trPr>
+        <w:tc>
+          <w:tcPr>
+            <w:tcW w:w="4320" w:type="dxa"/>
+            <w:tcBorders>
+              <w:top w:val="none" w:sz="0" w:space="0" w:color="FFFFFF"/>
+              <w:left w:val="none" w:sz="0" w:space="0" w:color="FFFFFF"/>
+              <w:bottom w:val="none" w:sz="0" w:space="0" w:color="FFFFFF"/>
+              <w:right w:val="none" w:sz="0" w:space="0" w:color="FFFFFF"/>
+            </w:tcBorders>
+            <w:tcMar>
+              <w:top w:w="40" w:type="dxa"/>
+              <w:left w:w="40" w:type="dxa"/>
+              <w:bottom w:w="40" w:type="dxa"/>
+              <w:right w:w="40" w:type="dxa"/>
+            </w:tcMar>
+          </w:tcPr>
+          <w:p>
+            <w:pPr>
+              <w:spacing w:after="20"/>
+              <w:jc w:val="center"/>
+            </w:pPr>
+            <w:r>
+              <w:rPr>
+                <w:noProof/>
+              </w:rPr>
+              <w:drawing>
+                <wp:inline distT="0" distB="0" distL="0" distR="0" wp14:anchorId="633B95B5" wp14:editId="7FEB1CB0">
+                  <wp:extent cx="2571750" cy="1447800"/>
+                  <wp:effectExtent l="0" t="0" r="0" b="0"/>
+                  <wp:docPr id="19" name="boss1.png" descr="boss1.png" title="boss1.png"/>
+                  <wp:cNvGraphicFramePr>
+                    <a:graphicFrameLocks xmlns:a="http://schemas.openxmlformats.org/drawingml/2006/main" noChangeAspect="1"/>
+                  </wp:cNvGraphicFramePr>
+                  <a:graphic xmlns:a="http://schemas.openxmlformats.org/drawingml/2006/main">
+                    <a:graphicData uri="http://schemas.openxmlformats.org/drawingml/2006/picture">
+                      <pic:pic xmlns:pic="http://schemas.openxmlformats.org/drawingml/2006/picture">
+                        <pic:nvPicPr>
+                          <pic:cNvPr id="0" name=""/>
+                          <pic:cNvPicPr>
+                            <a:picLocks noChangeAspect="1" noChangeArrowheads="1"/>
+                          </pic:cNvPicPr>
+                        </pic:nvPicPr>
+                        <pic:blipFill>
+                          <a:blip r:embed="rId23"/>
+                          <a:srcRect/>
+                          <a:stretch>
+                            <a:fillRect/>
+                          </a:stretch>
+                        </pic:blipFill>
+                        <pic:spPr bwMode="auto">
+                          <a:xfrm>
+                            <a:off x="0" y="0"/>
+                            <a:ext cx="2571750" cy="1447800"/>
+                          </a:xfrm>
+                          <a:prstGeom prst="rect">
+                            <a:avLst/>
+                          </a:prstGeom>
+                        </pic:spPr>
+                      </pic:pic>
+                    </a:graphicData>
+                  </a:graphic>
+                </wp:inline>
+              </w:drawing>
+            </w:r>
+          </w:p>
+          <w:p>
+            <w:pPr>
+              <w:spacing w:after="60"/>
+              <w:jc w:val="center"/>
+            </w:pPr>
+            <w:r>
+              <w:rPr>
+                <w:i/>
+                <w:iCs/>
+                <w:color w:val="555555"/>
+                <w:sz w:val="18"/>
+                <w:szCs w:val="18"/>
+              </w:rPr>
+              <w:t>El Arzobispo</w:t>
+            </w:r>
+            <w:r>
+              <w:rPr>
+                <w:i/>
+                <w:iCs/>
+                <w:color w:val="555555"/>
+                <w:sz w:val="18"/>
+                <w:szCs w:val="18"/>
+              </w:rPr>
+              <w:t>, fase 1</w:t>
+            </w:r>
+          </w:p>
+        </w:tc>
+        <w:tc>
+          <w:tcPr>
+            <w:tcW w:w="4320" w:type="dxa"/>
+            <w:tcBorders>
+              <w:top w:val="none" w:sz="0" w:space="0" w:color="FFFFFF"/>
+              <w:left w:val="none" w:sz="0" w:space="0" w:color="FFFFFF"/>
+              <w:bottom w:val="none" w:sz="0" w:space="0" w:color="FFFFFF"/>
+              <w:right w:val="none" w:sz="0" w:space="0" w:color="FFFFFF"/>
+            </w:tcBorders>
+            <w:tcMar>
+              <w:top w:w="40" w:type="dxa"/>
+              <w:left w:w="40" w:type="dxa"/>
+              <w:bottom w:w="40" w:type="dxa"/>
+              <w:right w:w="40" w:type="dxa"/>
+            </w:tcMar>
+          </w:tcPr>
+          <w:p>
+            <w:pPr>
+              <w:spacing w:after="20"/>
+              <w:jc w:val="center"/>
+            </w:pPr>
+            <w:r>
+              <w:rPr>
+                <w:noProof/>
+              </w:rPr>
+              <w:drawing>
+                <wp:inline distT="0" distB="0" distL="0" distR="0" wp14:anchorId="79B88744" wp14:editId="372A3B4F">
+                  <wp:extent cx="2571750" cy="1447800"/>
+                  <wp:effectExtent l="0" t="0" r="0" b="0"/>
+                  <wp:docPr id="20" name="boss2.png" descr="boss2.png" title="boss2.png"/>
+                  <wp:cNvGraphicFramePr>
+                    <a:graphicFrameLocks xmlns:a="http://schemas.openxmlformats.org/drawingml/2006/main" noChangeAspect="1"/>
+                  </wp:cNvGraphicFramePr>
+                  <a:graphic xmlns:a="http://schemas.openxmlformats.org/drawingml/2006/main">
+                    <a:graphicData uri="http://schemas.openxmlformats.org/drawingml/2006/picture">
+                      <pic:pic xmlns:pic="http://schemas.openxmlformats.org/drawingml/2006/picture">
+                        <pic:nvPicPr>
+                          <pic:cNvPr id="0" name=""/>
+                          <pic:cNvPicPr>
+                            <a:picLocks noChangeAspect="1" noChangeArrowheads="1"/>
+                          </pic:cNvPicPr>
+                        </pic:nvPicPr>
+                        <pic:blipFill>
+                          <a:blip r:embed="rId24"/>
+                          <a:srcRect/>
+                          <a:stretch>
+                            <a:fillRect/>
+                          </a:stretch>
+                        </pic:blipFill>
+                        <pic:spPr bwMode="auto">
+                          <a:xfrm>
+                            <a:off x="0" y="0"/>
+                            <a:ext cx="2571750" cy="1447800"/>
+                          </a:xfrm>
+                          <a:prstGeom prst="rect">
+                            <a:avLst/>
+                          </a:prstGeom>
+                        </pic:spPr>
+                      </pic:pic>
+                    </a:graphicData>
+                  </a:graphic>
+                </wp:inline>
+              </w:drawing>
+            </w:r>
+          </w:p>
+          <w:p>
+            <w:pPr>
+              <w:spacing w:after="60"/>
+              <w:jc w:val="center"/>
+            </w:pPr>
+            <w:r>
+              <w:rPr>
+                <w:i/>
+                <w:iCs/>
+                <w:color w:val="555555"/>
+                <w:sz w:val="18"/>
+                <w:szCs w:val="18"/>
+              </w:rPr>
+              <w:t>Fase 2: ojos y rayos</w:t>
+            </w:r>
+          </w:p>
+        </w:tc>
+      </w:tr>
+    </w:tbl>
     <w:p>
       <w:pPr>
         <w:pStyle w:val="Ttulo2"/>
@@ -3168,10 +3299,10 @@
         <w:spacing w:after="80" w:line="276" w:lineRule="auto"/>
       </w:pPr>
       <w:r>
-        <w:t>Las Cuevas (nivel 2): aparecen la oscuridad</w:t>
-      </w:r>
-      <w:r>
-        <w:t xml:space="preserve"> y los enemigos voladores; el Murciélago es la llave.</w:t>
+        <w:t>Las Cuevas (nivel 2): aparecen la oscuridad y los ene</w:t>
+      </w:r>
+      <w:r>
+        <w:t>migos voladores; el Murciélago es la llave.</w:t>
       </w:r>
     </w:p>
     <w:p>
@@ -3184,15 +3315,7 @@
         <w:spacing w:after="80" w:line="276" w:lineRule="auto"/>
       </w:pPr>
       <w:r>
-        <w:t xml:space="preserve">El Latido (nivel 3): el nivel más largo y vertical, con más arenas, rutas opcionales y </w:t>
-      </w:r>
-      <w:proofErr w:type="spellStart"/>
-      <w:r>
-        <w:t>puzzles</w:t>
-      </w:r>
-      <w:proofErr w:type="spellEnd"/>
-      <w:r>
-        <w:t xml:space="preserve"> que combinan las tres formas.</w:t>
+        <w:t>El Latido (nivel 3): el nivel más largo y vertical, con más arenas, rutas opcionales y puzzles que combinan las tres formas.</w:t>
       </w:r>
     </w:p>
     <w:p>
@@ -3205,18 +3328,7 @@
         <w:spacing w:after="80" w:line="276" w:lineRule="auto"/>
       </w:pPr>
       <w:r>
-        <w:t xml:space="preserve">El Santuario (jefe): exige dominar todas las formas, el </w:t>
-      </w:r>
-      <w:proofErr w:type="spellStart"/>
-      <w:r>
-        <w:t>parry</w:t>
-      </w:r>
-      <w:proofErr w:type="spellEnd"/>
-      <w:r>
-        <w:t xml:space="preserve"> y la gestión de</w:t>
-      </w:r>
-      <w:r>
-        <w:t xml:space="preserve"> energía.</w:t>
+        <w:t>El Santuario (jefe): exige dominar todas las formas, el parry y la gestión de energía.</w:t>
       </w:r>
     </w:p>
     <w:p>
@@ -3224,23 +3336,10 @@
         <w:spacing w:before="120"/>
       </w:pPr>
       <w:r>
-        <w:t xml:space="preserve">Los niveles alternan combate, </w:t>
-      </w:r>
-      <w:proofErr w:type="spellStart"/>
-      <w:r>
-        <w:t>plataformeo</w:t>
-      </w:r>
-      <w:proofErr w:type="spellEnd"/>
-      <w:r>
-        <w:t xml:space="preserve"> y </w:t>
-      </w:r>
-      <w:proofErr w:type="spellStart"/>
-      <w:r>
-        <w:t>puzzles</w:t>
-      </w:r>
-      <w:proofErr w:type="spellEnd"/>
-      <w:r>
-        <w:t>, con espacios de respiro entre arenas. La dificultad está diseñada para que el jugador sienta progreso sin llegar a ser frustrante.</w:t>
+        <w:t>Los niveles alternan combate, plataformeo y puzzles, con espacios de respiro entre arenas. La dificultad está diseñada para que el jugador sienta progreso sin llegar a s</w:t>
+      </w:r>
+      <w:r>
+        <w:t>er frustrante.</w:t>
       </w:r>
     </w:p>
     <w:p>
@@ -3251,7 +3350,6 @@
         <w:jc w:val="center"/>
       </w:pPr>
       <w:r>
-        <w:lastRenderedPageBreak/>
         <w:t>Apartado Visual</w:t>
       </w:r>
     </w:p>
@@ -3260,10 +3358,7 @@
         <w:spacing w:after="200" w:line="276" w:lineRule="auto"/>
       </w:pPr>
       <w:r>
-        <w:t>Utilizamos un estilo 2D ilustrado, con colores</w:t>
-      </w:r>
-      <w:r>
-        <w:t xml:space="preserve"> planos y siluetas claras, para todos los elementos visuales del juego:</w:t>
+        <w:t>Utilizamos un estilo 2D ilustrado, con colores planos y siluetas claras, para todos los elementos visuales del juego:</w:t>
       </w:r>
     </w:p>
     <w:p>
@@ -3282,13 +3377,11 @@
         </w:rPr>
         <w:t xml:space="preserve">Personajes - </w:t>
       </w:r>
-      <w:proofErr w:type="spellStart"/>
-      <w:r>
-        <w:t>sprites</w:t>
-      </w:r>
-      <w:proofErr w:type="spellEnd"/>
-      <w:r>
-        <w:t xml:space="preserve"> animados cuadro a cuadro (reposo, correr, saltar, ataques y daño). Cada forma tiene un tamaño distinto para reforzar su identidad.</w:t>
+      <w:r>
+        <w:t>sprites animados cuadro a cuadro (reposo, correr, saltar, ataques y daño). Cada forma tiene un</w:t>
+      </w:r>
+      <w:r>
+        <w:t xml:space="preserve"> tamaño distinto para reforzar su identidad.</w:t>
       </w:r>
     </w:p>
     <w:p>
@@ -3307,24 +3400,8 @@
         </w:rPr>
         <w:t xml:space="preserve">Fondos - </w:t>
       </w:r>
-      <w:proofErr w:type="spellStart"/>
-      <w:r>
-        <w:t>parallax</w:t>
-      </w:r>
-      <w:proofErr w:type="spellEnd"/>
-      <w:r>
-        <w:t xml:space="preserve"> </w:t>
-      </w:r>
-      <w:proofErr w:type="spellStart"/>
-      <w:r>
-        <w:t>scrolling</w:t>
-      </w:r>
-      <w:proofErr w:type="spellEnd"/>
-      <w:r>
-        <w:t xml:space="preserve"> con </w:t>
-      </w:r>
-      <w:r>
-        <w:t>capas por nivel (bosque, cueva natural y cueva profunda), más luciérnagas, niebla, rayos de luz y polvo de cueva.</w:t>
+      <w:r>
+        <w:t>parallax scrolling con capas por nivel (bosque, cueva natural y cueva profunda), más luciérnagas, niebla, rayos de luz y polvo de cueva.</w:t>
       </w:r>
     </w:p>
     <w:p>
@@ -3341,10 +3418,11 @@
           <w:b/>
           <w:bCs/>
         </w:rPr>
+        <w:lastRenderedPageBreak/>
         <w:t xml:space="preserve">Interfaz - </w:t>
       </w:r>
       <w:r>
-        <w:t>menú principal, pausa, controles, opciones, créditos, derrota y victoria.</w:t>
+        <w:t>menú principal con el logo dibujado a mano y la luna, pausa, controles, opciones, créditos, derrota y victoria. Los cómics de inicio y final usan viñetas en blanco y negro con globos de texto.</w:t>
       </w:r>
     </w:p>
     <w:p>
@@ -3364,10 +3442,10 @@
         <w:t xml:space="preserve">HUD - </w:t>
       </w:r>
       <w:r>
-        <w:t>arriba a la izquierda el retrato del Amuleto con la</w:t>
-      </w:r>
-      <w:r>
-        <w:t xml:space="preserve"> barra de vida (roja) y la de energía de transformación; el selector de formas, los fragmentos acumulados y una pila de golpes de combo aparecen cuando corresponde.</w:t>
+        <w:t>arriba a la izquierda el retrato del Amuleto con la barra</w:t>
+      </w:r>
+      <w:r>
+        <w:t xml:space="preserve"> de vida (roja) y la de energía de transformación; el selector de formas, los fragmentos acumulados y una pila de golpes de combo aparecen cuando corresponde.</w:t>
       </w:r>
     </w:p>
     <w:p>
@@ -3387,10 +3465,10 @@
         <w:t xml:space="preserve">Textos - </w:t>
       </w:r>
       <w:r>
-        <w:t xml:space="preserve">colores funcionales: verde para el bosque y lo vivo, azul y violeta para la cueva </w:t>
-      </w:r>
-      <w:r>
-        <w:t>profunda, rojo para el peligro y el jefe.</w:t>
+        <w:t>colores funcionales: verde para el bosque y lo vivo, azul y violeta para la cueva profun</w:t>
+      </w:r>
+      <w:r>
+        <w:t>da, rojo para el peligro y el jefe.</w:t>
       </w:r>
     </w:p>
     <w:tbl>
@@ -3441,10 +3519,10 @@
                 <w:noProof/>
               </w:rPr>
               <w:drawing>
-                <wp:inline distT="0" distB="0" distL="0" distR="0" wp14:anchorId="199DD9B8" wp14:editId="57B632A0">
+                <wp:inline distT="0" distB="0" distL="0" distR="0" wp14:anchorId="6A32060F" wp14:editId="1C1F6EC7">
                   <wp:extent cx="1695450" cy="952500"/>
                   <wp:effectExtent l="0" t="0" r="0" b="0"/>
-                  <wp:docPr id="16" name="hud.png" descr="hud.png" title="hud.png"/>
+                  <wp:docPr id="21" name="hud.png" descr="hud.png" title="hud.png"/>
                   <wp:cNvGraphicFramePr>
                     <a:graphicFrameLocks xmlns:a="http://schemas.openxmlformats.org/drawingml/2006/main" noChangeAspect="1"/>
                   </wp:cNvGraphicFramePr>
@@ -3458,7 +3536,7 @@
                           </pic:cNvPicPr>
                         </pic:nvPicPr>
                         <pic:blipFill>
-                          <a:blip r:embed="rId20"/>
+                          <a:blip r:embed="rId25"/>
                           <a:srcRect/>
                           <a:stretch>
                             <a:fillRect/>
@@ -3523,10 +3601,10 @@
                 <w:noProof/>
               </w:rPr>
               <w:drawing>
-                <wp:inline distT="0" distB="0" distL="0" distR="0" wp14:anchorId="03C0F93F" wp14:editId="1D26A68D">
+                <wp:inline distT="0" distB="0" distL="0" distR="0" wp14:anchorId="7CE98F66" wp14:editId="272F245B">
                   <wp:extent cx="1695450" cy="952500"/>
                   <wp:effectExtent l="0" t="0" r="0" b="0"/>
-                  <wp:docPr id="17" name="menu.png" descr="menu.png" title="menu.png"/>
+                  <wp:docPr id="22" name="menu.png" descr="menu.png" title="menu.png"/>
                   <wp:cNvGraphicFramePr>
                     <a:graphicFrameLocks xmlns:a="http://schemas.openxmlformats.org/drawingml/2006/main" noChangeAspect="1"/>
                   </wp:cNvGraphicFramePr>
@@ -3540,7 +3618,7 @@
                           </pic:cNvPicPr>
                         </pic:nvPicPr>
                         <pic:blipFill>
-                          <a:blip r:embed="rId21"/>
+                          <a:blip r:embed="rId26"/>
                           <a:srcRect/>
                           <a:stretch>
                             <a:fillRect/>
@@ -3605,10 +3683,10 @@
                 <w:noProof/>
               </w:rPr>
               <w:drawing>
-                <wp:inline distT="0" distB="0" distL="0" distR="0" wp14:anchorId="6ED03FB1" wp14:editId="46286CA6">
+                <wp:inline distT="0" distB="0" distL="0" distR="0" wp14:anchorId="56928AE7" wp14:editId="4EE7A392">
                   <wp:extent cx="1695450" cy="952500"/>
                   <wp:effectExtent l="0" t="0" r="0" b="0"/>
-                  <wp:docPr id="18" name="g_ctrl.png" descr="g_ctrl.png" title="g_ctrl.png"/>
+                  <wp:docPr id="23" name="g_ctrl.png" descr="g_ctrl.png" title="g_ctrl.png"/>
                   <wp:cNvGraphicFramePr>
                     <a:graphicFrameLocks xmlns:a="http://schemas.openxmlformats.org/drawingml/2006/main" noChangeAspect="1"/>
                   </wp:cNvGraphicFramePr>
@@ -3622,7 +3700,7 @@
                           </pic:cNvPicPr>
                         </pic:nvPicPr>
                         <pic:blipFill>
-                          <a:blip r:embed="rId22"/>
+                          <a:blip r:embed="rId27"/>
                           <a:srcRect/>
                           <a:stretch>
                             <a:fillRect/>
@@ -3682,53 +3760,12 @@
         </w:numPr>
         <w:spacing w:after="80" w:line="276" w:lineRule="auto"/>
       </w:pPr>
-      <w:proofErr w:type="spellStart"/>
-      <w:r>
-        <w:rPr>
-          <w:b/>
-          <w:bCs/>
-        </w:rPr>
-        <w:t>Hitstop</w:t>
-      </w:r>
-      <w:proofErr w:type="spellEnd"/>
-      <w:r>
-        <w:rPr>
-          <w:b/>
-          <w:bCs/>
-        </w:rPr>
-        <w:t xml:space="preserve"> y </w:t>
-      </w:r>
-      <w:proofErr w:type="spellStart"/>
-      <w:r>
-        <w:rPr>
-          <w:b/>
-          <w:bCs/>
-        </w:rPr>
-        <w:t>screen</w:t>
-      </w:r>
-      <w:proofErr w:type="spellEnd"/>
-      <w:r>
-        <w:rPr>
-          <w:b/>
-          <w:bCs/>
-        </w:rPr>
-        <w:t xml:space="preserve"> </w:t>
-      </w:r>
-      <w:proofErr w:type="spellStart"/>
-      <w:r>
-        <w:rPr>
-          <w:b/>
-          <w:bCs/>
-        </w:rPr>
-        <w:t>shake</w:t>
-      </w:r>
-      <w:proofErr w:type="spellEnd"/>
-      <w:r>
-        <w:rPr>
-          <w:b/>
-          <w:bCs/>
-        </w:rPr>
-        <w:t xml:space="preserve"> - </w:t>
+      <w:r>
+        <w:rPr>
+          <w:b/>
+          <w:bCs/>
+        </w:rPr>
+        <w:t xml:space="preserve">Hitstop y screen shake - </w:t>
       </w:r>
       <w:r>
         <w:t>temblor de cámara y pausa breve al golpear, aterrizar y cambiar de fase del jefe.</w:t>
@@ -3788,23 +3825,7 @@
           <w:b/>
           <w:bCs/>
         </w:rPr>
-        <w:t xml:space="preserve">Squash &amp; </w:t>
-      </w:r>
-      <w:proofErr w:type="spellStart"/>
-      <w:r>
-        <w:rPr>
-          <w:b/>
-          <w:bCs/>
-        </w:rPr>
-        <w:t>stretch</w:t>
-      </w:r>
-      <w:proofErr w:type="spellEnd"/>
-      <w:r>
-        <w:rPr>
-          <w:b/>
-          <w:bCs/>
-        </w:rPr>
-        <w:t xml:space="preserve"> - </w:t>
+        <w:t xml:space="preserve">Squash &amp; stretch - </w:t>
       </w:r>
       <w:r>
         <w:t>achata</w:t>
@@ -3822,21 +3843,12 @@
         </w:numPr>
         <w:spacing w:after="80" w:line="276" w:lineRule="auto"/>
       </w:pPr>
-      <w:proofErr w:type="spellStart"/>
-      <w:r>
-        <w:rPr>
-          <w:b/>
-          <w:bCs/>
-        </w:rPr>
-        <w:t>Parry</w:t>
-      </w:r>
-      <w:proofErr w:type="spellEnd"/>
-      <w:r>
-        <w:rPr>
-          <w:b/>
-          <w:bCs/>
-        </w:rPr>
-        <w:t xml:space="preserve"> - </w:t>
+      <w:r>
+        <w:rPr>
+          <w:b/>
+          <w:bCs/>
+        </w:rPr>
+        <w:t xml:space="preserve">Parry - </w:t>
       </w:r>
       <w:r>
         <w:t>destello y efecto blanco y negro al desviar un golpe justo.</w:t>
@@ -3900,15 +3912,7 @@
         <w:spacing w:after="200" w:line="276" w:lineRule="auto"/>
       </w:pPr>
       <w:r>
-        <w:t xml:space="preserve">Ambiente sonoro por zona (bosque y cuevas) y efectos de sonido para saltos, golpes, </w:t>
-      </w:r>
-      <w:proofErr w:type="spellStart"/>
-      <w:r>
-        <w:t>parry</w:t>
-      </w:r>
-      <w:proofErr w:type="spellEnd"/>
-      <w:r>
-        <w:t xml:space="preserve"> y transformaciones. La música está pendiente de definir.</w:t>
+        <w:t>Ambiente sonoro por zona (bosque y cuevas) y efectos de sonido para saltos, golpes, parry y transformaciones. La música está pendiente de definir.</w:t>
       </w:r>
     </w:p>
     <w:p>
@@ -3931,15 +3935,7 @@
         <w:t xml:space="preserve">Motor de desarrollo: </w:t>
       </w:r>
       <w:r>
-        <w:t>Godot 4.7 (</w:t>
-      </w:r>
-      <w:proofErr w:type="spellStart"/>
-      <w:r>
-        <w:t>GDScript</w:t>
-      </w:r>
-      <w:proofErr w:type="spellEnd"/>
-      <w:r>
-        <w:t>)</w:t>
+        <w:t>Godot 4.7 (GDScript)</w:t>
       </w:r>
     </w:p>
     <w:p>
@@ -3960,22 +3956,25 @@
           <w:b/>
           <w:bCs/>
         </w:rPr>
-        <w:t xml:space="preserve">Plataforma objetivo: </w:t>
-      </w:r>
-      <w:r>
-        <w:t>PC (Wi</w:t>
-      </w:r>
-      <w:r>
-        <w:t>ndows), con teclado y mando</w:t>
-      </w:r>
-    </w:p>
-    <w:p>
-      <w:r>
-        <w:rPr>
-          <w:b/>
-          <w:bCs/>
-        </w:rPr>
-        <w:lastRenderedPageBreak/>
+        <w:t>Plata</w:t>
+      </w:r>
+      <w:r>
+        <w:rPr>
+          <w:b/>
+          <w:bCs/>
+        </w:rPr>
+        <w:t xml:space="preserve">forma objetivo: </w:t>
+      </w:r>
+      <w:r>
+        <w:t>PC (Windows), con teclado y mando</w:t>
+      </w:r>
+    </w:p>
+    <w:p>
+      <w:r>
+        <w:rPr>
+          <w:b/>
+          <w:bCs/>
+        </w:rPr>
         <w:t xml:space="preserve">Duración estimada: </w:t>
       </w:r>
       <w:r>
@@ -4025,29 +4024,14 @@
         <w:spacing w:after="200" w:line="276" w:lineRule="auto"/>
       </w:pPr>
       <w:r>
-        <w:t xml:space="preserve">Jugadores de 12 años en </w:t>
-      </w:r>
-      <w:r>
-        <w:t xml:space="preserve">adelante aficionados a la acción y las plataformas 2D. El juego es accesible (controles simples, </w:t>
-      </w:r>
-      <w:proofErr w:type="spellStart"/>
-      <w:r>
-        <w:t>checkpoints</w:t>
-      </w:r>
-      <w:proofErr w:type="spellEnd"/>
-      <w:r>
-        <w:t xml:space="preserve"> frecuentes, ayudas del Amuleto) pero tiene profundidad suficiente para quienes disfrutan del timing del </w:t>
-      </w:r>
-      <w:proofErr w:type="spellStart"/>
-      <w:r>
-        <w:t>parry</w:t>
-      </w:r>
-      <w:proofErr w:type="spellEnd"/>
-      <w:r>
-        <w:t>, los combos y la gestión de energía e</w:t>
-      </w:r>
-      <w:r>
-        <w:t>ntre formas.</w:t>
+        <w:t xml:space="preserve">Jugadores de 12 años en adelante aficionados a la acción y las plataformas 2D. El juego es accesible (controles simples, checkpoints frecuentes, ayudas del Amuleto) pero tiene profundidad </w:t>
+      </w:r>
+      <w:r>
+        <w:lastRenderedPageBreak/>
+        <w:t>suficiente par</w:t>
+      </w:r>
+      <w:r>
+        <w:t>a quienes disfrutan del timing del parry, los combos y la gestión de energía entre formas.</w:t>
       </w:r>
     </w:p>
     <w:sectPr>
@@ -4063,10 +4047,96 @@
 <file path=word/numbering.xml><?xml version="1.0" encoding="utf-8"?>
 <w:numbering xmlns:wpc="http://schemas.microsoft.com/office/word/2010/wordprocessingCanvas" xmlns:cx="http://schemas.microsoft.com/office/drawing/2014/chartex" xmlns:cx1="http://schemas.microsoft.com/office/drawing/2015/9/8/chartex" xmlns:cx2="http://schemas.microsoft.com/office/drawing/2015/10/21/chartex" xmlns:cx3="http://schemas.microsoft.com/office/drawing/2016/5/9/chartex" xmlns:cx4="http://schemas.microsoft.com/office/drawing/2016/5/10/chartex" xmlns:cx5="http://schemas.microsoft.com/office/drawing/2016/5/11/chartex" xmlns:cx6="http://schemas.microsoft.com/office/drawing/2016/5/12/chartex" xmlns:cx7="http://schemas.microsoft.com/office/drawing/2016/5/13/chartex" xmlns:cx8="http://schemas.microsoft.com/office/drawing/2016/5/14/chartex" xmlns:mc="http://schemas.openxmlformats.org/markup-compatibility/2006" xmlns:aink="http://schemas.microsoft.com/office/drawing/2016/ink" xmlns:am3d="http://schemas.microsoft.com/office/drawing/2017/model3d" xmlns:o="urn:schemas-microsoft-com:office:office" xmlns:r="http://schemas.openxmlformats.org/officeDocument/2006/relationships" xmlns:m="http://schemas.openxmlformats.org/officeDocument/2006/math" xmlns:v="urn:schemas-microsoft-com:vml" xmlns:wp14="http://schemas.microsoft.com/office/word/2010/wordprocessingDrawing" xmlns:wp="http://schemas.openxmlformats.org/drawingml/2006/wordprocessingDrawing" xmlns:w10="urn:schemas-microsoft-com:office:word" xmlns:w="http://schemas.openxmlformats.org/wordprocessingml/2006/main" xmlns:w14="http://schemas.microsoft.com/office/word/2010/wordml" xmlns:w15="http://schemas.microsoft.com/office/word/2012/wordml" xmlns:w16cex="http://schemas.microsoft.com/office/word/2018/wordml/cex" xmlns:w16cid="http://schemas.microsoft.com/office/word/2016/wordml/cid" xmlns:w16="http://schemas.microsoft.com/office/word/2018/wordml" xmlns:w16sdtdh="http://schemas.microsoft.com/office/word/2020/wordml/sdtdatahash" xmlns:w16se="http://schemas.microsoft.com/office/word/2015/wordml/symex" xmlns:wpg="http://schemas.microsoft.com/office/word/2010/wordprocessingGroup" xmlns:wpi="http://schemas.microsoft.com/office/word/2010/wordprocessingInk" xmlns:wne="http://schemas.microsoft.com/office/word/2006/wordml" xmlns:wps="http://schemas.microsoft.com/office/word/2010/wordprocessingShape" mc:Ignorable="w14 w15 w16se w16cid w16 w16cex w16sdtdh wp14">
   <w:abstractNum w:abstractNumId="0" w15:restartNumberingAfterBreak="0">
-    <w:nsid w:val="18215787"/>
+    <w:nsid w:val="3A116A72"/>
     <w:multiLevelType w:val="hybridMultilevel"/>
-    <w:tmpl w:val="309C20B2"/>
-    <w:lvl w:ilvl="0" w:tplc="95148DDC">
+    <w:tmpl w:val="D0E6A884"/>
+    <w:lvl w:ilvl="0" w:tplc="6BFC0AF8" w:tentative="1">
+      <w:start w:val="1"/>
+      <w:numFmt w:val="bullet"/>
+      <w:lvlText w:val="●"/>
+      <w:lvlJc w:val="left"/>
+      <w:pPr>
+        <w:ind w:left="720" w:hanging="360"/>
+      </w:pPr>
+    </w:lvl>
+    <w:lvl w:ilvl="1" w:tplc="2C006E70" w:tentative="1">
+      <w:start w:val="1"/>
+      <w:numFmt w:val="bullet"/>
+      <w:lvlText w:val="○"/>
+      <w:lvlJc w:val="left"/>
+      <w:pPr>
+        <w:ind w:left="1440" w:hanging="360"/>
+      </w:pPr>
+    </w:lvl>
+    <w:lvl w:ilvl="2" w:tplc="5ACA5080" w:tentative="1">
+      <w:start w:val="1"/>
+      <w:numFmt w:val="bullet"/>
+      <w:lvlText w:val="■"/>
+      <w:lvlJc w:val="left"/>
+      <w:pPr>
+        <w:ind w:left="2160" w:hanging="360"/>
+      </w:pPr>
+    </w:lvl>
+    <w:lvl w:ilvl="3" w:tplc="B636B694" w:tentative="1">
+      <w:start w:val="1"/>
+      <w:numFmt w:val="bullet"/>
+      <w:lvlText w:val="●"/>
+      <w:lvlJc w:val="left"/>
+      <w:pPr>
+        <w:ind w:left="2880" w:hanging="360"/>
+      </w:pPr>
+    </w:lvl>
+    <w:lvl w:ilvl="4" w:tplc="ECE47A60" w:tentative="1">
+      <w:start w:val="1"/>
+      <w:numFmt w:val="bullet"/>
+      <w:lvlText w:val="○"/>
+      <w:lvlJc w:val="left"/>
+      <w:pPr>
+        <w:ind w:left="3600" w:hanging="360"/>
+      </w:pPr>
+    </w:lvl>
+    <w:lvl w:ilvl="5" w:tplc="4904AA4A" w:tentative="1">
+      <w:start w:val="1"/>
+      <w:numFmt w:val="bullet"/>
+      <w:lvlText w:val="■"/>
+      <w:lvlJc w:val="left"/>
+      <w:pPr>
+        <w:ind w:left="4320" w:hanging="360"/>
+      </w:pPr>
+    </w:lvl>
+    <w:lvl w:ilvl="6" w:tplc="8BEA1ADE" w:tentative="1">
+      <w:start w:val="1"/>
+      <w:numFmt w:val="bullet"/>
+      <w:lvlText w:val="●"/>
+      <w:lvlJc w:val="left"/>
+      <w:pPr>
+        <w:ind w:left="5040" w:hanging="360"/>
+      </w:pPr>
+    </w:lvl>
+    <w:lvl w:ilvl="7" w:tplc="2B469FDE" w:tentative="1">
+      <w:start w:val="1"/>
+      <w:numFmt w:val="bullet"/>
+      <w:lvlText w:val="●"/>
+      <w:lvlJc w:val="left"/>
+      <w:pPr>
+        <w:ind w:left="5760" w:hanging="360"/>
+      </w:pPr>
+    </w:lvl>
+    <w:lvl w:ilvl="8" w:tplc="89202012" w:tentative="1">
+      <w:start w:val="1"/>
+      <w:numFmt w:val="bullet"/>
+      <w:lvlText w:val="●"/>
+      <w:lvlJc w:val="left"/>
+      <w:pPr>
+        <w:ind w:left="6480" w:hanging="360"/>
+      </w:pPr>
+    </w:lvl>
+  </w:abstractNum>
+  <w:abstractNum w:abstractNumId="1" w15:restartNumberingAfterBreak="0">
+    <w:nsid w:val="4BFF46C5"/>
+    <w:multiLevelType w:val="hybridMultilevel"/>
+    <w:tmpl w:val="84B483C6"/>
+    <w:lvl w:ilvl="0" w:tplc="BB622778">
       <w:start w:val="1"/>
       <w:numFmt w:val="bullet"/>
       <w:lvlText w:val="-"/>
@@ -4078,141 +4148,55 @@
         <w:rFonts w:ascii="Times New Roman" w:eastAsia="Times New Roman" w:hAnsi="Times New Roman" w:cs="Times New Roman"/>
       </w:rPr>
     </w:lvl>
-    <w:lvl w:ilvl="1" w:tplc="BDD2A736">
+    <w:lvl w:ilvl="1" w:tplc="B2D2C06A">
       <w:numFmt w:val="decimal"/>
       <w:lvlText w:val=""/>
       <w:lvlJc w:val="left"/>
     </w:lvl>
-    <w:lvl w:ilvl="2" w:tplc="595213D8">
+    <w:lvl w:ilvl="2" w:tplc="1DAE235A">
       <w:numFmt w:val="decimal"/>
       <w:lvlText w:val=""/>
       <w:lvlJc w:val="left"/>
     </w:lvl>
-    <w:lvl w:ilvl="3" w:tplc="8FDEA44A">
+    <w:lvl w:ilvl="3" w:tplc="B7ACE99E">
       <w:numFmt w:val="decimal"/>
       <w:lvlText w:val=""/>
       <w:lvlJc w:val="left"/>
     </w:lvl>
-    <w:lvl w:ilvl="4" w:tplc="2DB4DC02">
+    <w:lvl w:ilvl="4" w:tplc="149AD794">
       <w:numFmt w:val="decimal"/>
       <w:lvlText w:val=""/>
       <w:lvlJc w:val="left"/>
     </w:lvl>
-    <w:lvl w:ilvl="5" w:tplc="B87AB1CC">
+    <w:lvl w:ilvl="5" w:tplc="C6961F98">
       <w:numFmt w:val="decimal"/>
       <w:lvlText w:val=""/>
       <w:lvlJc w:val="left"/>
     </w:lvl>
-    <w:lvl w:ilvl="6" w:tplc="5666EF6A">
+    <w:lvl w:ilvl="6" w:tplc="62C2188C">
       <w:numFmt w:val="decimal"/>
       <w:lvlText w:val=""/>
       <w:lvlJc w:val="left"/>
     </w:lvl>
-    <w:lvl w:ilvl="7" w:tplc="440273EC">
+    <w:lvl w:ilvl="7" w:tplc="02C6A432">
       <w:numFmt w:val="decimal"/>
       <w:lvlText w:val=""/>
       <w:lvlJc w:val="left"/>
     </w:lvl>
-    <w:lvl w:ilvl="8" w:tplc="929CF338">
+    <w:lvl w:ilvl="8" w:tplc="C4348DF4">
       <w:numFmt w:val="decimal"/>
       <w:lvlText w:val=""/>
       <w:lvlJc w:val="left"/>
     </w:lvl>
   </w:abstractNum>
-  <w:abstractNum w:abstractNumId="1" w15:restartNumberingAfterBreak="0">
-    <w:nsid w:val="582603B8"/>
-    <w:multiLevelType w:val="hybridMultilevel"/>
-    <w:tmpl w:val="96A24826"/>
-    <w:lvl w:ilvl="0" w:tplc="3D2AF02A" w:tentative="1">
-      <w:start w:val="1"/>
-      <w:numFmt w:val="bullet"/>
-      <w:lvlText w:val="●"/>
-      <w:lvlJc w:val="left"/>
-      <w:pPr>
-        <w:ind w:left="720" w:hanging="360"/>
-      </w:pPr>
-    </w:lvl>
-    <w:lvl w:ilvl="1" w:tplc="190E6EB2" w:tentative="1">
-      <w:start w:val="1"/>
-      <w:numFmt w:val="bullet"/>
-      <w:lvlText w:val="○"/>
-      <w:lvlJc w:val="left"/>
-      <w:pPr>
-        <w:ind w:left="1440" w:hanging="360"/>
-      </w:pPr>
-    </w:lvl>
-    <w:lvl w:ilvl="2" w:tplc="24C8779E" w:tentative="1">
-      <w:start w:val="1"/>
-      <w:numFmt w:val="bullet"/>
-      <w:lvlText w:val="■"/>
-      <w:lvlJc w:val="left"/>
-      <w:pPr>
-        <w:ind w:left="2160" w:hanging="360"/>
-      </w:pPr>
-    </w:lvl>
-    <w:lvl w:ilvl="3" w:tplc="872899B6" w:tentative="1">
-      <w:start w:val="1"/>
-      <w:numFmt w:val="bullet"/>
-      <w:lvlText w:val="●"/>
-      <w:lvlJc w:val="left"/>
-      <w:pPr>
-        <w:ind w:left="2880" w:hanging="360"/>
-      </w:pPr>
-    </w:lvl>
-    <w:lvl w:ilvl="4" w:tplc="4CEA4660" w:tentative="1">
-      <w:start w:val="1"/>
-      <w:numFmt w:val="bullet"/>
-      <w:lvlText w:val="○"/>
-      <w:lvlJc w:val="left"/>
-      <w:pPr>
-        <w:ind w:left="3600" w:hanging="360"/>
-      </w:pPr>
-    </w:lvl>
-    <w:lvl w:ilvl="5" w:tplc="278C9FBE" w:tentative="1">
-      <w:start w:val="1"/>
-      <w:numFmt w:val="bullet"/>
-      <w:lvlText w:val="■"/>
-      <w:lvlJc w:val="left"/>
-      <w:pPr>
-        <w:ind w:left="4320" w:hanging="360"/>
-      </w:pPr>
-    </w:lvl>
-    <w:lvl w:ilvl="6" w:tplc="E826A0DC" w:tentative="1">
-      <w:start w:val="1"/>
-      <w:numFmt w:val="bullet"/>
-      <w:lvlText w:val="●"/>
-      <w:lvlJc w:val="left"/>
-      <w:pPr>
-        <w:ind w:left="5040" w:hanging="360"/>
-      </w:pPr>
-    </w:lvl>
-    <w:lvl w:ilvl="7" w:tplc="B47C71BA" w:tentative="1">
-      <w:start w:val="1"/>
-      <w:numFmt w:val="bullet"/>
-      <w:lvlText w:val="●"/>
-      <w:lvlJc w:val="left"/>
-      <w:pPr>
-        <w:ind w:left="5760" w:hanging="360"/>
-      </w:pPr>
-    </w:lvl>
-    <w:lvl w:ilvl="8" w:tplc="7DB285EC" w:tentative="1">
-      <w:start w:val="1"/>
-      <w:numFmt w:val="bullet"/>
-      <w:lvlText w:val="●"/>
-      <w:lvlJc w:val="left"/>
-      <w:pPr>
-        <w:ind w:left="6480" w:hanging="360"/>
-      </w:pPr>
-    </w:lvl>
-  </w:abstractNum>
   <w:num w:numId="1">
-    <w:abstractNumId w:val="1"/>
+    <w:abstractNumId w:val="0"/>
     <w:lvlOverride w:ilvl="0">
       <w:startOverride w:val="1"/>
     </w:lvlOverride>
   </w:num>
   <w:num w:numId="2">
-    <w:abstractNumId w:val="0"/>
+    <w:abstractNumId w:val="1"/>
     <w:lvlOverride w:ilvl="0">
       <w:startOverride w:val="1"/>
     </w:lvlOverride>

</xml_diff>